<commit_message>
Evidencias de ejecución de pruebas del Sprint 1
- Evidencias/Pruebas/Sprint 1: una carpeta por caso (MTC_0010 a MTC_0250)
  con capturas, respuestas de la API y verificaciones en la base de datos.
  Resumen: 22 OK, 1 NOK (MTC_0070), 1 Bloqueado (MTC_0110) y
  MTC_0250 (UAT) pendiente, con su pauta de sesión.
- Plan de pruebas (Plan_de_Pruebas_Bomberos_completado.xlsx).
- Guía del estudiante 2.4 actualizada.

Co-Authored-By: Claude Opus 5.5 <noreply@anthropic.com>
</commit_message>
<xml_diff>
--- a/Fase 2/Evidencias/Evidencia Grupal/2.4_GuiaEstudiante_Fase 2_DesarrolloProyecto APT.docx
+++ b/Fase 2/Evidencias/Evidencia Grupal/2.4_GuiaEstudiante_Fase 2_DesarrolloProyecto APT.docx
@@ -19,7 +19,7 @@
         <mc:AlternateContent>
           <mc:Choice Requires="wpg">
             <w:drawing>
-              <wp:anchor distT="0" distB="0" distL="114300" distR="114300" simplePos="0" relativeHeight="251659264" behindDoc="0" locked="0" layoutInCell="1" allowOverlap="1" wp14:anchorId="39581AEC" wp14:editId="040D9366">
+              <wp:anchor distT="0" distB="0" distL="114300" distR="114300" simplePos="0" relativeHeight="251659264" behindDoc="0" locked="0" layoutInCell="1" allowOverlap="1" wp14:anchorId="0027440D" wp14:editId="7D6A5DA4">
                 <wp:simplePos x="0" y="0"/>
                 <wp:positionH relativeFrom="margin">
                   <wp:align>center</wp:align>
@@ -69,7 +69,6 @@
                           <w:txbxContent>
                             <w:p>
                               <w:pPr>
-                                <w:spacing w:after="0" w:line="240" w:lineRule="auto"/>
                                 <w:rPr>
                                   <w:b/>
                                   <w:color w:val="FF0000"/>
@@ -80,7 +79,6 @@
                             </w:p>
                             <w:p>
                               <w:pPr>
-                                <w:spacing w:after="0" w:line="240" w:lineRule="auto"/>
                                 <w:rPr>
                                   <w:b/>
                                   <w:color w:val="1F3864" w:themeColor="accent1" w:themeShade="80"/>
@@ -145,7 +143,6 @@
                             </w:p>
                             <w:p>
                               <w:pPr>
-                                <w:spacing w:after="0" w:line="240" w:lineRule="auto"/>
                                 <w:rPr>
                                   <w:b/>
                                   <w:color w:val="1F3864" w:themeColor="accent1" w:themeShade="80"/>
@@ -162,7 +159,6 @@
                                 </w:rPr>
                                 <w:t xml:space="preserve">Asignatura </w:t>
                               </w:r>
-                              <w:proofErr w:type="spellStart"/>
                               <w:r>
                                 <w:rPr>
                                   <w:b/>
@@ -172,7 +168,6 @@
                                 </w:rPr>
                                 <w:t>Capstone</w:t>
                               </w:r>
-                              <w:proofErr w:type="spellEnd"/>
                             </w:p>
                           </w:txbxContent>
                         </wps:txbx>
@@ -237,7 +232,7 @@
           </mc:Choice>
           <mc:Fallback>
             <w:pict>
-              <v:group w14:anchorId="39581AEC" id="Grupo 27" o:spid="_x0000_s1026" style="position:absolute;margin-left:0;margin-top:.75pt;width:491.25pt;height:123pt;z-index:251659264;mso-position-horizontal:center;mso-position-horizontal-relative:margin;mso-width-relative:margin;mso-height-relative:margin" coordsize="59912,15621" o:gfxdata="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">
+              <v:group w14:anchorId="0027440D" id="Grupo 27" o:spid="_x0000_s1026" style="position:absolute;margin-left:0;margin-top:.75pt;width:491.25pt;height:123pt;z-index:251659264;mso-position-horizontal:center;mso-position-horizontal-relative:margin;mso-width-relative:margin;mso-height-relative:margin" coordsize="59912,15621" o:gfxdata="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">
                 <v:shapetype id="_x0000_t202" coordsize="21600,21600" o:spt="202" path="m,l,21600r21600,l21600,xe">
                   <v:stroke joinstyle="miter"/>
                   <v:path gradientshapeok="t" o:connecttype="rect"/>
@@ -247,7 +242,6 @@
                     <w:txbxContent>
                       <w:p>
                         <w:pPr>
-                          <w:spacing w:after="0" w:line="240" w:lineRule="auto"/>
                           <w:rPr>
                             <w:b/>
                             <w:color w:val="FF0000"/>
@@ -258,7 +252,6 @@
                       </w:p>
                       <w:p>
                         <w:pPr>
-                          <w:spacing w:after="0" w:line="240" w:lineRule="auto"/>
                           <w:rPr>
                             <w:b/>
                             <w:color w:val="1F3864" w:themeColor="accent1" w:themeShade="80"/>
@@ -323,7 +316,6 @@
                       </w:p>
                       <w:p>
                         <w:pPr>
-                          <w:spacing w:after="0" w:line="240" w:lineRule="auto"/>
                           <w:rPr>
                             <w:b/>
                             <w:color w:val="1F3864" w:themeColor="accent1" w:themeShade="80"/>
@@ -543,7 +535,6 @@
     </w:tbl>
     <w:p>
       <w:pPr>
-        <w:spacing w:after="0" w:line="240" w:lineRule="auto"/>
         <w:rPr>
           <w:rFonts w:cs="Calibri Light"/>
           <w:color w:val="595959" w:themeColor="text1" w:themeTint="A6"/>
@@ -555,7 +546,6 @@
     </w:p>
     <w:p>
       <w:pPr>
-        <w:spacing w:after="0" w:line="240" w:lineRule="auto"/>
         <w:rPr>
           <w:rFonts w:cs="Calibri Light"/>
           <w:color w:val="595959" w:themeColor="text1" w:themeTint="A6"/>
@@ -581,8 +571,8 @@
         <w:tblLook w:val="04A0" w:firstRow="1" w:lastRow="0" w:firstColumn="1" w:lastColumn="0" w:noHBand="0" w:noVBand="1"/>
       </w:tblPr>
       <w:tblGrid>
-        <w:gridCol w:w="2528"/>
-        <w:gridCol w:w="7111"/>
+        <w:gridCol w:w="1361"/>
+        <w:gridCol w:w="8720"/>
       </w:tblGrid>
       <w:tr>
         <w:tc>
@@ -770,29 +760,38 @@
                 <w:lang w:eastAsia="es-CL"/>
               </w:rPr>
             </w:pPr>
-            <w:proofErr w:type="gramStart"/>
-            <w:r>
-              <w:rPr>
-                <w:rFonts w:ascii="Calibri" w:hAnsi="Calibri" w:cs="Arial"/>
-                <w:i/>
-                <w:color w:val="548DD4"/>
-                <w:sz w:val="20"/>
-                <w:szCs w:val="20"/>
-                <w:lang w:eastAsia="es-CL"/>
-              </w:rPr>
-              <w:t>En caso que</w:t>
-            </w:r>
-            <w:proofErr w:type="gramEnd"/>
-            <w:r>
-              <w:rPr>
-                <w:rFonts w:ascii="Calibri" w:hAnsi="Calibri" w:cs="Arial"/>
-                <w:i/>
-                <w:color w:val="548DD4"/>
-                <w:sz w:val="20"/>
-                <w:szCs w:val="20"/>
-                <w:lang w:eastAsia="es-CL"/>
-              </w:rPr>
-              <w:t xml:space="preserve"> hayas realizado ajustes a los objetivos o metodología, debes incluir dichos apartados nuevamente en este informe, señalando cuáles son dichos ajustes.</w:t>
+            <w:r>
+              <w:rPr>
+                <w:rFonts w:ascii="Calibri" w:hAnsi="Calibri" w:cs="Arial"/>
+                <w:i/>
+                <w:color w:val="548DD4"/>
+                <w:sz w:val="20"/>
+                <w:szCs w:val="20"/>
+                <w:lang w:eastAsia="es-CL"/>
+              </w:rPr>
+              <w:t>En caso que hayas realizado ajustes a los objetivos o metodología, debes incluir dichos apartados nuevamente en este informe, señalando cuáles son dichos ajustes.</w:t>
+            </w:r>
+          </w:p>
+          <w:p>
+            <w:pPr>
+              <w:spacing w:after="60"/>
+              <w:ind w:left="227" w:hanging="227"/>
+            </w:pPr>
+          </w:p>
+          <w:p>
+            <w:pPr>
+              <w:spacing w:after="60"/>
+            </w:pPr>
+            <w:r>
+              <w:rPr>
+                <w:rFonts w:ascii="Calibri" w:hAnsi="Calibri" w:cs="Arial"/>
+                <w:b/>
+                <w:i/>
+                <w:sz w:val="20"/>
+                <w:szCs w:val="20"/>
+                <w:lang w:eastAsia="es-CL"/>
+              </w:rPr>
+              <w:t>Como resumen de avance, pasamos de desarrollar un prototipo en Figma a llevarlo en un entorno de trabajo aplicando las funcionalidades establecidas, requeridas y evaluando como se espera que funcione.</w:t>
             </w:r>
           </w:p>
         </w:tc>
@@ -886,24 +885,19 @@
           </w:tcPr>
           <w:p>
             <w:pPr>
+              <w:spacing w:after="60"/>
               <w:jc w:val="both"/>
-              <w:rPr>
-                <w:rFonts w:ascii="Calibri" w:hAnsi="Calibri" w:cs="Arial"/>
-                <w:i/>
-                <w:sz w:val="20"/>
-                <w:szCs w:val="20"/>
-                <w:lang w:eastAsia="es-CL"/>
-              </w:rPr>
-            </w:pPr>
-            <w:r>
-              <w:rPr>
-                <w:rFonts w:ascii="Calibri" w:hAnsi="Calibri" w:cs="Arial"/>
-                <w:i/>
-                <w:sz w:val="20"/>
-                <w:szCs w:val="20"/>
-                <w:lang w:eastAsia="es-CL"/>
-              </w:rPr>
-              <w:t>Se trabajo con la metodología SCRUM</w:t>
+            </w:pPr>
+            <w:r>
+              <w:rPr>
+                <w:rFonts w:ascii="Calibri" w:hAnsi="Calibri" w:cs="Arial"/>
+                <w:i/>
+                <w:color w:val="548DD4"/>
+                <w:sz w:val="20"/>
+                <w:szCs w:val="20"/>
+                <w:lang w:eastAsia="es-CL"/>
+              </w:rPr>
+              <w:t>Opcional en caso de ajuste</w:t>
             </w:r>
           </w:p>
         </w:tc>
@@ -924,6 +918,86 @@
                 <w:color w:val="1F3864" w:themeColor="accent1" w:themeShade="80"/>
               </w:rPr>
             </w:pPr>
+          </w:p>
+          <w:p>
+            <w:pPr>
+              <w:rPr>
+                <w:rFonts w:ascii="Calibri" w:hAnsi="Calibri"/>
+                <w:color w:val="1F3864" w:themeColor="accent1" w:themeShade="80"/>
+              </w:rPr>
+            </w:pPr>
+          </w:p>
+          <w:p>
+            <w:pPr>
+              <w:rPr>
+                <w:rFonts w:ascii="Calibri" w:hAnsi="Calibri"/>
+                <w:color w:val="1F3864" w:themeColor="accent1" w:themeShade="80"/>
+              </w:rPr>
+            </w:pPr>
+          </w:p>
+          <w:p>
+            <w:pPr>
+              <w:rPr>
+                <w:rFonts w:ascii="Calibri" w:hAnsi="Calibri"/>
+                <w:color w:val="1F3864" w:themeColor="accent1" w:themeShade="80"/>
+              </w:rPr>
+            </w:pPr>
+          </w:p>
+          <w:p>
+            <w:pPr>
+              <w:rPr>
+                <w:rFonts w:ascii="Calibri" w:hAnsi="Calibri"/>
+                <w:color w:val="1F3864" w:themeColor="accent1" w:themeShade="80"/>
+              </w:rPr>
+            </w:pPr>
+          </w:p>
+          <w:p>
+            <w:pPr>
+              <w:rPr>
+                <w:rFonts w:ascii="Calibri" w:hAnsi="Calibri"/>
+                <w:color w:val="1F3864" w:themeColor="accent1" w:themeShade="80"/>
+              </w:rPr>
+            </w:pPr>
+          </w:p>
+          <w:p>
+            <w:pPr>
+              <w:rPr>
+                <w:rFonts w:ascii="Calibri" w:hAnsi="Calibri"/>
+                <w:color w:val="1F3864" w:themeColor="accent1" w:themeShade="80"/>
+              </w:rPr>
+            </w:pPr>
+          </w:p>
+          <w:p>
+            <w:pPr>
+              <w:rPr>
+                <w:rFonts w:ascii="Calibri" w:hAnsi="Calibri"/>
+                <w:color w:val="1F3864" w:themeColor="accent1" w:themeShade="80"/>
+              </w:rPr>
+            </w:pPr>
+          </w:p>
+          <w:p>
+            <w:pPr>
+              <w:rPr>
+                <w:rFonts w:ascii="Calibri" w:hAnsi="Calibri"/>
+                <w:color w:val="1F3864" w:themeColor="accent1" w:themeShade="80"/>
+              </w:rPr>
+            </w:pPr>
+          </w:p>
+          <w:p>
+            <w:pPr>
+              <w:rPr>
+                <w:rFonts w:ascii="Calibri" w:hAnsi="Calibri"/>
+                <w:color w:val="1F3864" w:themeColor="accent1" w:themeShade="80"/>
+              </w:rPr>
+            </w:pPr>
+          </w:p>
+          <w:p>
+            <w:pPr>
+              <w:rPr>
+                <w:rFonts w:ascii="Calibri" w:hAnsi="Calibri"/>
+                <w:color w:val="1F3864" w:themeColor="accent1" w:themeShade="80"/>
+              </w:rPr>
+            </w:pPr>
             <w:r>
               <w:rPr>
                 <w:rFonts w:ascii="Calibri" w:hAnsi="Calibri"/>
@@ -1288,24 +1362,279 @@
               <w:jc w:val="both"/>
               <w:rPr>
                 <w:rFonts w:ascii="Calibri" w:hAnsi="Calibri" w:cs="Arial"/>
+                <w:i/>
+                <w:color w:val="548DD4"/>
+                <w:sz w:val="20"/>
+                <w:szCs w:val="20"/>
+                <w:lang w:eastAsia="es-CL"/>
+              </w:rPr>
+            </w:pPr>
+            <w:r>
+              <w:rPr>
+                <w:rFonts w:ascii="Calibri" w:hAnsi="Calibri" w:cs="Arial"/>
+                <w:i/>
+                <w:color w:val="548DD4"/>
+                <w:sz w:val="20"/>
+                <w:szCs w:val="20"/>
+                <w:lang w:eastAsia="es-CL"/>
+              </w:rPr>
+              <w:t>En este apartado adjuntar la(s) evidencia(s) seleccionada(s) para ser evaluada por el docente.</w:t>
+            </w:r>
+          </w:p>
+          <w:p>
+            <w:pPr>
+              <w:pStyle w:val="Prrafodelista"/>
+              <w:numPr>
+                <w:ilvl w:val="0"/>
+                <w:numId w:val="2"/>
+              </w:numPr>
+              <w:jc w:val="both"/>
+              <w:rPr>
+                <w:rFonts w:ascii="Calibri" w:hAnsi="Calibri" w:cs="Arial"/>
                 <w:b/>
                 <w:i/>
-                <w:color w:val="548DD4"/>
-                <w:sz w:val="20"/>
-                <w:szCs w:val="20"/>
-                <w:lang w:eastAsia="es-CL"/>
-              </w:rPr>
-            </w:pPr>
-            <w:r>
-              <w:rPr>
-                <w:rFonts w:ascii="Calibri" w:hAnsi="Calibri" w:cs="Arial"/>
-                <w:i/>
-                <w:color w:val="548DD4"/>
-                <w:sz w:val="20"/>
-                <w:szCs w:val="20"/>
-                <w:lang w:eastAsia="es-CL"/>
-              </w:rPr>
-              <w:t>En este apartado adjuntar la(s) evidencia(s) seleccionada(s) para ser evaluada por el docente.</w:t>
+                <w:sz w:val="20"/>
+                <w:szCs w:val="20"/>
+                <w:lang w:eastAsia="es-CL"/>
+              </w:rPr>
+            </w:pPr>
+            <w:r>
+              <w:rPr>
+                <w:rFonts w:ascii="Calibri" w:hAnsi="Calibri" w:cs="Arial"/>
+                <w:b/>
+                <w:i/>
+                <w:sz w:val="20"/>
+                <w:szCs w:val="20"/>
+                <w:lang w:eastAsia="es-CL"/>
+              </w:rPr>
+              <w:t>Como evidencia de avance tenemos el repositorio grupal en GitHub que se va actualizando cada vez que se avanza en algún aspecto del proyecto.</w:t>
+            </w:r>
+          </w:p>
+          <w:p>
+            <w:pPr>
+              <w:jc w:val="both"/>
+              <w:rPr>
+                <w:rFonts w:ascii="Calibri" w:hAnsi="Calibri" w:cs="Arial"/>
+                <w:b/>
+                <w:i/>
+                <w:sz w:val="20"/>
+                <w:szCs w:val="20"/>
+                <w:lang w:eastAsia="es-CL"/>
+              </w:rPr>
+            </w:pPr>
+            <w:r>
+              <w:rPr>
+                <w:rFonts w:ascii="Calibri" w:hAnsi="Calibri" w:cs="Arial"/>
+                <w:b/>
+                <w:i/>
+                <w:sz w:val="20"/>
+                <w:szCs w:val="20"/>
+                <w:lang w:eastAsia="es-CL"/>
+              </w:rPr>
+              <w:lastRenderedPageBreak/>
+              <w:drawing>
+                <wp:inline distT="0" distB="0" distL="0" distR="0" wp14:anchorId="7A26C87F" wp14:editId="3CE69E22">
+                  <wp:extent cx="5400040" cy="2436495"/>
+                  <wp:effectExtent l="0" t="0" r="0" b="1905"/>
+                  <wp:docPr id="1" name="Imagen 1"/>
+                  <wp:cNvGraphicFramePr>
+                    <a:graphicFrameLocks xmlns:a="http://schemas.openxmlformats.org/drawingml/2006/main" noChangeAspect="1"/>
+                  </wp:cNvGraphicFramePr>
+                  <a:graphic xmlns:a="http://schemas.openxmlformats.org/drawingml/2006/main">
+                    <a:graphicData uri="http://schemas.openxmlformats.org/drawingml/2006/picture">
+                      <pic:pic xmlns:pic="http://schemas.openxmlformats.org/drawingml/2006/picture">
+                        <pic:nvPicPr>
+                          <pic:cNvPr id="1" name=""/>
+                          <pic:cNvPicPr/>
+                        </pic:nvPicPr>
+                        <pic:blipFill>
+                          <a:blip r:embed="rId10"/>
+                          <a:stretch>
+                            <a:fillRect/>
+                          </a:stretch>
+                        </pic:blipFill>
+                        <pic:spPr>
+                          <a:xfrm>
+                            <a:off x="0" y="0"/>
+                            <a:ext cx="5400040" cy="2436495"/>
+                          </a:xfrm>
+                          <a:prstGeom prst="rect">
+                            <a:avLst/>
+                          </a:prstGeom>
+                        </pic:spPr>
+                      </pic:pic>
+                    </a:graphicData>
+                  </a:graphic>
+                </wp:inline>
+              </w:drawing>
+            </w:r>
+          </w:p>
+          <w:p>
+            <w:pPr>
+              <w:pStyle w:val="Prrafodelista"/>
+              <w:numPr>
+                <w:ilvl w:val="0"/>
+                <w:numId w:val="2"/>
+              </w:numPr>
+              <w:jc w:val="both"/>
+              <w:rPr>
+                <w:rFonts w:ascii="Calibri" w:hAnsi="Calibri" w:cs="Arial"/>
+                <w:b/>
+                <w:i/>
+                <w:sz w:val="20"/>
+                <w:szCs w:val="20"/>
+                <w:lang w:eastAsia="es-CL"/>
+              </w:rPr>
+            </w:pPr>
+            <w:r>
+              <w:rPr>
+                <w:rFonts w:ascii="Calibri" w:hAnsi="Calibri" w:cs="Arial"/>
+                <w:b/>
+                <w:i/>
+                <w:sz w:val="20"/>
+                <w:szCs w:val="20"/>
+                <w:lang w:eastAsia="es-CL"/>
+              </w:rPr>
+              <w:t>Levantamiento del proyecto en Docker</w:t>
+            </w:r>
+          </w:p>
+          <w:p>
+            <w:pPr>
+              <w:jc w:val="both"/>
+              <w:rPr>
+                <w:rFonts w:ascii="Calibri" w:hAnsi="Calibri" w:cs="Arial"/>
+                <w:b/>
+                <w:i/>
+                <w:sz w:val="20"/>
+                <w:szCs w:val="20"/>
+                <w:lang w:eastAsia="es-CL"/>
+              </w:rPr>
+            </w:pPr>
+            <w:r>
+              <w:rPr>
+                <w:rFonts w:ascii="Calibri" w:hAnsi="Calibri" w:cs="Arial"/>
+                <w:b/>
+                <w:i/>
+                <w:sz w:val="20"/>
+                <w:szCs w:val="20"/>
+                <w:lang w:eastAsia="es-CL"/>
+              </w:rPr>
+              <w:drawing>
+                <wp:inline distT="0" distB="0" distL="0" distR="0" wp14:anchorId="764D4AB3" wp14:editId="0E37B8C1">
+                  <wp:extent cx="5400040" cy="2895600"/>
+                  <wp:effectExtent l="0" t="0" r="0" b="0"/>
+                  <wp:docPr id="2" name="Imagen 2"/>
+                  <wp:cNvGraphicFramePr>
+                    <a:graphicFrameLocks xmlns:a="http://schemas.openxmlformats.org/drawingml/2006/main" noChangeAspect="1"/>
+                  </wp:cNvGraphicFramePr>
+                  <a:graphic xmlns:a="http://schemas.openxmlformats.org/drawingml/2006/main">
+                    <a:graphicData uri="http://schemas.openxmlformats.org/drawingml/2006/picture">
+                      <pic:pic xmlns:pic="http://schemas.openxmlformats.org/drawingml/2006/picture">
+                        <pic:nvPicPr>
+                          <pic:cNvPr id="1" name=""/>
+                          <pic:cNvPicPr/>
+                        </pic:nvPicPr>
+                        <pic:blipFill>
+                          <a:blip r:embed="rId11"/>
+                          <a:stretch>
+                            <a:fillRect/>
+                          </a:stretch>
+                        </pic:blipFill>
+                        <pic:spPr>
+                          <a:xfrm>
+                            <a:off x="0" y="0"/>
+                            <a:ext cx="5400040" cy="2895600"/>
+                          </a:xfrm>
+                          <a:prstGeom prst="rect">
+                            <a:avLst/>
+                          </a:prstGeom>
+                        </pic:spPr>
+                      </pic:pic>
+                    </a:graphicData>
+                  </a:graphic>
+                </wp:inline>
+              </w:drawing>
+            </w:r>
+          </w:p>
+          <w:p>
+            <w:pPr>
+              <w:pStyle w:val="Prrafodelista"/>
+              <w:numPr>
+                <w:ilvl w:val="0"/>
+                <w:numId w:val="2"/>
+              </w:numPr>
+              <w:jc w:val="both"/>
+              <w:rPr>
+                <w:rFonts w:ascii="Calibri" w:hAnsi="Calibri" w:cs="Arial"/>
+                <w:b/>
+                <w:i/>
+                <w:sz w:val="20"/>
+                <w:szCs w:val="20"/>
+                <w:lang w:eastAsia="es-CL"/>
+              </w:rPr>
+            </w:pPr>
+            <w:r>
+              <w:rPr>
+                <w:rFonts w:ascii="Calibri" w:hAnsi="Calibri" w:cs="Arial"/>
+                <w:b/>
+                <w:i/>
+                <w:sz w:val="20"/>
+                <w:szCs w:val="20"/>
+                <w:lang w:eastAsia="es-CL"/>
+              </w:rPr>
+              <w:t>Desarrollo de tablero en Trello</w:t>
+            </w:r>
+          </w:p>
+          <w:p>
+            <w:pPr>
+              <w:spacing w:after="60"/>
+              <w:ind w:left="340" w:hanging="227"/>
+              <w:jc w:val="both"/>
+            </w:pPr>
+            <w:r>
+              <w:rPr>
+                <w:rFonts w:ascii="Calibri" w:hAnsi="Calibri" w:cs="Arial"/>
+                <w:b/>
+                <w:i/>
+                <w:sz w:val="20"/>
+                <w:szCs w:val="20"/>
+                <w:lang w:eastAsia="es-CL"/>
+              </w:rPr>
+              <w:drawing>
+                <wp:inline distT="0" distB="0" distL="0" distR="0" wp14:anchorId="26EC2EFE" wp14:editId="4DD39074">
+                  <wp:extent cx="4960620" cy="2248729"/>
+                  <wp:effectExtent l="0" t="0" r="0" b="0"/>
+                  <wp:docPr id="4" name="Imagen 4"/>
+                  <wp:cNvGraphicFramePr>
+                    <a:graphicFrameLocks xmlns:a="http://schemas.openxmlformats.org/drawingml/2006/main" noChangeAspect="1"/>
+                  </wp:cNvGraphicFramePr>
+                  <a:graphic xmlns:a="http://schemas.openxmlformats.org/drawingml/2006/main">
+                    <a:graphicData uri="http://schemas.openxmlformats.org/drawingml/2006/picture">
+                      <pic:pic xmlns:pic="http://schemas.openxmlformats.org/drawingml/2006/picture">
+                        <pic:nvPicPr>
+                          <pic:cNvPr id="1" name=""/>
+                          <pic:cNvPicPr/>
+                        </pic:nvPicPr>
+                        <pic:blipFill>
+                          <a:blip r:embed="rId12"/>
+                          <a:stretch>
+                            <a:fillRect/>
+                          </a:stretch>
+                        </pic:blipFill>
+                        <pic:spPr>
+                          <a:xfrm>
+                            <a:off x="0" y="0"/>
+                            <a:ext cx="4968606" cy="2252349"/>
+                          </a:xfrm>
+                          <a:prstGeom prst="rect">
+                            <a:avLst/>
+                          </a:prstGeom>
+                        </pic:spPr>
+                      </pic:pic>
+                    </a:graphicData>
+                  </a:graphic>
+                </wp:inline>
+              </w:drawing>
             </w:r>
           </w:p>
         </w:tc>
@@ -1423,7 +1752,6 @@
     </w:tbl>
     <w:p>
       <w:pPr>
-        <w:spacing w:after="0" w:line="240" w:lineRule="auto"/>
         <w:rPr>
           <w:rFonts w:cs="Calibri Light"/>
           <w:color w:val="595959" w:themeColor="text1" w:themeTint="A6"/>
@@ -1450,14 +1778,14 @@
         <w:tblLook w:val="04A0" w:firstRow="1" w:lastRow="0" w:firstColumn="1" w:lastColumn="0" w:noHBand="0" w:noVBand="1"/>
       </w:tblPr>
       <w:tblGrid>
-        <w:gridCol w:w="1328"/>
-        <w:gridCol w:w="1077"/>
-        <w:gridCol w:w="1276"/>
-        <w:gridCol w:w="1276"/>
-        <w:gridCol w:w="1275"/>
-        <w:gridCol w:w="1276"/>
-        <w:gridCol w:w="1418"/>
-        <w:gridCol w:w="850"/>
+        <w:gridCol w:w="1050"/>
+        <w:gridCol w:w="1150"/>
+        <w:gridCol w:w="1100"/>
+        <w:gridCol w:w="900"/>
+        <w:gridCol w:w="1150"/>
+        <w:gridCol w:w="1300"/>
+        <w:gridCol w:w="1050"/>
+        <w:gridCol w:w="2076"/>
       </w:tblGrid>
       <w:tr>
         <w:trPr>
@@ -1495,7 +1823,7 @@
         </w:trPr>
         <w:tc>
           <w:tcPr>
-            <w:tcW w:w="1328" w:type="dxa"/>
+            <w:tcW w:w="1050" w:type="dxa"/>
             <w:vAlign w:val="center"/>
           </w:tcPr>
           <w:p>
@@ -1535,7 +1863,7 @@
         </w:tc>
         <w:tc>
           <w:tcPr>
-            <w:tcW w:w="1077" w:type="dxa"/>
+            <w:tcW w:w="1150" w:type="dxa"/>
             <w:vAlign w:val="center"/>
           </w:tcPr>
           <w:p>
@@ -1559,7 +1887,7 @@
         </w:tc>
         <w:tc>
           <w:tcPr>
-            <w:tcW w:w="1276" w:type="dxa"/>
+            <w:tcW w:w="1100" w:type="dxa"/>
             <w:vAlign w:val="center"/>
           </w:tcPr>
           <w:p>
@@ -1583,7 +1911,7 @@
         </w:tc>
         <w:tc>
           <w:tcPr>
-            <w:tcW w:w="1276" w:type="dxa"/>
+            <w:tcW w:w="900" w:type="dxa"/>
             <w:vAlign w:val="center"/>
           </w:tcPr>
           <w:p>
@@ -1607,7 +1935,7 @@
         </w:tc>
         <w:tc>
           <w:tcPr>
-            <w:tcW w:w="1275" w:type="dxa"/>
+            <w:tcW w:w="1150" w:type="dxa"/>
             <w:vAlign w:val="center"/>
           </w:tcPr>
           <w:p>
@@ -1640,7 +1968,7 @@
         </w:tc>
         <w:tc>
           <w:tcPr>
-            <w:tcW w:w="1276" w:type="dxa"/>
+            <w:tcW w:w="1300" w:type="dxa"/>
             <w:vAlign w:val="center"/>
           </w:tcPr>
           <w:p>
@@ -1664,7 +1992,7 @@
         </w:tc>
         <w:tc>
           <w:tcPr>
-            <w:tcW w:w="1418" w:type="dxa"/>
+            <w:tcW w:w="1050" w:type="dxa"/>
             <w:vAlign w:val="center"/>
           </w:tcPr>
           <w:p>
@@ -1688,7 +2016,7 @@
         </w:tc>
         <w:tc>
           <w:tcPr>
-            <w:tcW w:w="850" w:type="dxa"/>
+            <w:tcW w:w="2076" w:type="dxa"/>
             <w:vAlign w:val="center"/>
           </w:tcPr>
           <w:p>
@@ -1725,7 +2053,7 @@
         </w:trPr>
         <w:tc>
           <w:tcPr>
-            <w:tcW w:w="1328" w:type="dxa"/>
+            <w:tcW w:w="1050" w:type="dxa"/>
           </w:tcPr>
           <w:p>
             <w:pPr>
@@ -1795,7 +2123,7 @@
         </w:tc>
         <w:tc>
           <w:tcPr>
-            <w:tcW w:w="1077" w:type="dxa"/>
+            <w:tcW w:w="1150" w:type="dxa"/>
           </w:tcPr>
           <w:p>
             <w:pPr>
@@ -1868,7 +2196,7 @@
         </w:tc>
         <w:tc>
           <w:tcPr>
-            <w:tcW w:w="1276" w:type="dxa"/>
+            <w:tcW w:w="1100" w:type="dxa"/>
           </w:tcPr>
           <w:p>
             <w:pPr>
@@ -1916,7 +2244,7 @@
         </w:tc>
         <w:tc>
           <w:tcPr>
-            <w:tcW w:w="1276" w:type="dxa"/>
+            <w:tcW w:w="900" w:type="dxa"/>
           </w:tcPr>
           <w:p>
             <w:pPr>
@@ -1986,7 +2314,7 @@
         </w:tc>
         <w:tc>
           <w:tcPr>
-            <w:tcW w:w="1275" w:type="dxa"/>
+            <w:tcW w:w="1150" w:type="dxa"/>
           </w:tcPr>
           <w:p>
             <w:pPr>
@@ -2048,7 +2376,7 @@
         </w:tc>
         <w:tc>
           <w:tcPr>
-            <w:tcW w:w="1276" w:type="dxa"/>
+            <w:tcW w:w="1300" w:type="dxa"/>
           </w:tcPr>
           <w:p>
             <w:pPr>
@@ -2110,7 +2438,7 @@
         </w:tc>
         <w:tc>
           <w:tcPr>
-            <w:tcW w:w="1418" w:type="dxa"/>
+            <w:tcW w:w="1050" w:type="dxa"/>
           </w:tcPr>
           <w:p>
             <w:pPr>
@@ -2244,7 +2572,7 @@
         </w:tc>
         <w:tc>
           <w:tcPr>
-            <w:tcW w:w="850" w:type="dxa"/>
+            <w:tcW w:w="2076" w:type="dxa"/>
           </w:tcPr>
           <w:p>
             <w:pPr>
@@ -2312,6 +2640,2292 @@
                 <w:lang w:eastAsia="es-CL"/>
               </w:rPr>
               <w:t xml:space="preserve">do. </w:t>
+            </w:r>
+          </w:p>
+        </w:tc>
+      </w:tr>
+      <w:tr>
+        <w:tc>
+          <w:tcPr>
+            <w:tcW w:w="1050" w:type="dxa"/>
+          </w:tcPr>
+          <w:p>
+            <w:pPr>
+              <w:rPr>
+                <w:b/>
+                <w:sz w:val="18"/>
+                <w:szCs w:val="24"/>
+              </w:rPr>
+            </w:pPr>
+            <w:r>
+              <w:rPr>
+                <w:rFonts w:ascii="Calibri" w:hAnsi="Calibri"/>
+                <w:color w:val="000000"/>
+                <w:sz w:val="16"/>
+              </w:rPr>
+              <w:t>Análisis y evaluación de soluciones informáticas</w:t>
+            </w:r>
+          </w:p>
+        </w:tc>
+        <w:tc>
+          <w:tcPr>
+            <w:tcW w:w="1150" w:type="dxa"/>
+          </w:tcPr>
+          <w:p>
+            <w:pPr>
+              <w:rPr>
+                <w:rFonts w:ascii="Calibri" w:hAnsi="Calibri" w:cs="Arial"/>
+                <w:i/>
+                <w:color w:val="548DD4"/>
+                <w:sz w:val="18"/>
+                <w:szCs w:val="20"/>
+                <w:lang w:eastAsia="es-CL"/>
+              </w:rPr>
+            </w:pPr>
+            <w:r>
+              <w:rPr>
+                <w:rFonts w:ascii="Calibri" w:hAnsi="Calibri"/>
+                <w:color w:val="000000"/>
+                <w:sz w:val="16"/>
+              </w:rPr>
+              <w:t>Análisis del caso</w:t>
+            </w:r>
+          </w:p>
+        </w:tc>
+        <w:tc>
+          <w:tcPr>
+            <w:tcW w:w="1100" w:type="dxa"/>
+          </w:tcPr>
+          <w:p>
+            <w:pPr>
+              <w:rPr>
+                <w:b/>
+                <w:sz w:val="18"/>
+                <w:szCs w:val="24"/>
+              </w:rPr>
+            </w:pPr>
+            <w:r>
+              <w:rPr>
+                <w:rFonts w:ascii="Calibri" w:hAnsi="Calibri"/>
+                <w:color w:val="000000"/>
+                <w:sz w:val="16"/>
+              </w:rPr>
+              <w:t>Propuesta original, entrevista exploratoria, fuentes institucionales</w:t>
+            </w:r>
+          </w:p>
+        </w:tc>
+        <w:tc>
+          <w:tcPr>
+            <w:tcW w:w="900" w:type="dxa"/>
+          </w:tcPr>
+          <w:p>
+            <w:pPr>
+              <w:rPr>
+                <w:b/>
+                <w:sz w:val="18"/>
+                <w:szCs w:val="24"/>
+              </w:rPr>
+            </w:pPr>
+            <w:r>
+              <w:rPr>
+                <w:rFonts w:ascii="Calibri" w:hAnsi="Calibri"/>
+                <w:color w:val="000000"/>
+                <w:sz w:val="16"/>
+              </w:rPr>
+              <w:t>1 semana</w:t>
+            </w:r>
+          </w:p>
+        </w:tc>
+        <w:tc>
+          <w:tcPr>
+            <w:tcW w:w="1150" w:type="dxa"/>
+          </w:tcPr>
+          <w:p>
+            <w:pPr>
+              <w:rPr>
+                <w:rFonts w:ascii="Calibri" w:hAnsi="Calibri" w:cs="Arial"/>
+                <w:i/>
+                <w:color w:val="548DD4"/>
+                <w:sz w:val="18"/>
+                <w:szCs w:val="20"/>
+                <w:lang w:eastAsia="es-CL"/>
+              </w:rPr>
+            </w:pPr>
+            <w:r>
+              <w:rPr>
+                <w:rFonts w:ascii="Calibri" w:hAnsi="Calibri"/>
+                <w:color w:val="000000"/>
+                <w:sz w:val="16"/>
+              </w:rPr>
+              <w:t>Equipo completo (Ramón Ortiz – Scrum Master)</w:t>
+            </w:r>
+          </w:p>
+        </w:tc>
+        <w:tc>
+          <w:tcPr>
+            <w:tcW w:w="1300" w:type="dxa"/>
+          </w:tcPr>
+          <w:p>
+            <w:pPr>
+              <w:rPr>
+                <w:rFonts w:ascii="Calibri" w:hAnsi="Calibri" w:cs="Arial"/>
+                <w:i/>
+                <w:color w:val="548DD4"/>
+                <w:sz w:val="18"/>
+                <w:szCs w:val="20"/>
+                <w:lang w:eastAsia="es-CL"/>
+              </w:rPr>
+            </w:pPr>
+            <w:r>
+              <w:rPr>
+                <w:rFonts w:ascii="Calibri" w:hAnsi="Calibri"/>
+                <w:color w:val="000000"/>
+                <w:sz w:val="16"/>
+              </w:rPr>
+              <w:t>Facilitador: contacto directo con la Primera Compañía de Maipú.</w:t>
+            </w:r>
+          </w:p>
+        </w:tc>
+        <w:tc>
+          <w:tcPr>
+            <w:tcW w:w="1050" w:type="dxa"/>
+          </w:tcPr>
+          <w:p>
+            <w:pPr>
+              <w:rPr>
+                <w:rFonts w:ascii="Calibri" w:hAnsi="Calibri" w:cs="Arial"/>
+                <w:i/>
+                <w:color w:val="548DD4"/>
+                <w:sz w:val="18"/>
+                <w:szCs w:val="20"/>
+                <w:lang w:eastAsia="es-CL"/>
+              </w:rPr>
+            </w:pPr>
+            <w:r>
+              <w:rPr>
+                <w:rFonts w:ascii="Calibri" w:hAnsi="Calibri"/>
+                <w:color w:val="000000"/>
+                <w:sz w:val="16"/>
+              </w:rPr>
+              <w:t>Completado</w:t>
+            </w:r>
+          </w:p>
+        </w:tc>
+        <w:tc>
+          <w:tcPr>
+            <w:tcW w:w="2076" w:type="dxa"/>
+          </w:tcPr>
+          <w:p>
+            <w:pPr>
+              <w:rPr>
+                <w:rFonts w:ascii="Calibri" w:hAnsi="Calibri" w:cs="Arial"/>
+                <w:i/>
+                <w:color w:val="548DD4"/>
+                <w:sz w:val="18"/>
+                <w:szCs w:val="20"/>
+                <w:lang w:eastAsia="es-CL"/>
+              </w:rPr>
+            </w:pPr>
+          </w:p>
+        </w:tc>
+      </w:tr>
+      <w:tr>
+        <w:tc>
+          <w:tcPr>
+            <w:tcW w:w="1050" w:type="dxa"/>
+          </w:tcPr>
+          <w:p>
+            <w:pPr>
+              <w:rPr>
+                <w:b/>
+                <w:sz w:val="18"/>
+                <w:szCs w:val="24"/>
+              </w:rPr>
+            </w:pPr>
+            <w:r>
+              <w:rPr>
+                <w:rFonts w:ascii="Calibri" w:hAnsi="Calibri"/>
+                <w:color w:val="000000"/>
+                <w:sz w:val="16"/>
+              </w:rPr>
+              <w:t>Gestión de proyectos informáticos</w:t>
+            </w:r>
+          </w:p>
+        </w:tc>
+        <w:tc>
+          <w:tcPr>
+            <w:tcW w:w="1150" w:type="dxa"/>
+          </w:tcPr>
+          <w:p>
+            <w:pPr>
+              <w:rPr>
+                <w:rFonts w:ascii="Calibri" w:hAnsi="Calibri" w:cs="Arial"/>
+                <w:i/>
+                <w:color w:val="548DD4"/>
+                <w:sz w:val="18"/>
+                <w:szCs w:val="20"/>
+                <w:lang w:eastAsia="es-CL"/>
+              </w:rPr>
+            </w:pPr>
+            <w:r>
+              <w:rPr>
+                <w:rFonts w:ascii="Calibri" w:hAnsi="Calibri"/>
+                <w:color w:val="000000"/>
+                <w:sz w:val="16"/>
+              </w:rPr>
+              <w:t>Roles y responsabilidades</w:t>
+            </w:r>
+          </w:p>
+        </w:tc>
+        <w:tc>
+          <w:tcPr>
+            <w:tcW w:w="1100" w:type="dxa"/>
+          </w:tcPr>
+          <w:p>
+            <w:pPr>
+              <w:rPr>
+                <w:b/>
+                <w:sz w:val="18"/>
+                <w:szCs w:val="24"/>
+              </w:rPr>
+            </w:pPr>
+            <w:r>
+              <w:rPr>
+                <w:rFonts w:ascii="Calibri" w:hAnsi="Calibri"/>
+                <w:color w:val="000000"/>
+                <w:sz w:val="16"/>
+              </w:rPr>
+              <w:t>Reunión con el equipo</w:t>
+            </w:r>
+          </w:p>
+        </w:tc>
+        <w:tc>
+          <w:tcPr>
+            <w:tcW w:w="900" w:type="dxa"/>
+          </w:tcPr>
+          <w:p>
+            <w:pPr>
+              <w:rPr>
+                <w:b/>
+                <w:sz w:val="18"/>
+                <w:szCs w:val="24"/>
+              </w:rPr>
+            </w:pPr>
+            <w:r>
+              <w:rPr>
+                <w:rFonts w:ascii="Calibri" w:hAnsi="Calibri"/>
+                <w:color w:val="000000"/>
+                <w:sz w:val="16"/>
+              </w:rPr>
+              <w:t>2 días</w:t>
+            </w:r>
+          </w:p>
+        </w:tc>
+        <w:tc>
+          <w:tcPr>
+            <w:tcW w:w="1150" w:type="dxa"/>
+          </w:tcPr>
+          <w:p>
+            <w:pPr>
+              <w:rPr>
+                <w:rFonts w:ascii="Calibri" w:hAnsi="Calibri" w:cs="Arial"/>
+                <w:i/>
+                <w:color w:val="548DD4"/>
+                <w:sz w:val="18"/>
+                <w:szCs w:val="20"/>
+                <w:lang w:eastAsia="es-CL"/>
+              </w:rPr>
+            </w:pPr>
+            <w:r>
+              <w:rPr>
+                <w:rFonts w:ascii="Calibri" w:hAnsi="Calibri"/>
+                <w:color w:val="000000"/>
+                <w:sz w:val="16"/>
+              </w:rPr>
+              <w:t>Equipo completo</w:t>
+            </w:r>
+          </w:p>
+        </w:tc>
+        <w:tc>
+          <w:tcPr>
+            <w:tcW w:w="1300" w:type="dxa"/>
+          </w:tcPr>
+          <w:p>
+            <w:pPr>
+              <w:rPr>
+                <w:rFonts w:ascii="Calibri" w:hAnsi="Calibri" w:cs="Arial"/>
+                <w:i/>
+                <w:color w:val="548DD4"/>
+                <w:sz w:val="18"/>
+                <w:szCs w:val="20"/>
+                <w:lang w:eastAsia="es-CL"/>
+              </w:rPr>
+            </w:pPr>
+            <w:r>
+              <w:rPr>
+                <w:rFonts w:ascii="Calibri" w:hAnsi="Calibri"/>
+                <w:color w:val="000000"/>
+                <w:sz w:val="16"/>
+              </w:rPr>
+              <w:t>Facilitador: cada integrante conoce las tareas de los demás.</w:t>
+            </w:r>
+          </w:p>
+        </w:tc>
+        <w:tc>
+          <w:tcPr>
+            <w:tcW w:w="1050" w:type="dxa"/>
+          </w:tcPr>
+          <w:p>
+            <w:pPr>
+              <w:rPr>
+                <w:rFonts w:ascii="Calibri" w:hAnsi="Calibri" w:cs="Arial"/>
+                <w:i/>
+                <w:color w:val="548DD4"/>
+                <w:sz w:val="18"/>
+                <w:szCs w:val="20"/>
+                <w:lang w:eastAsia="es-CL"/>
+              </w:rPr>
+            </w:pPr>
+            <w:r>
+              <w:rPr>
+                <w:rFonts w:ascii="Calibri" w:hAnsi="Calibri"/>
+                <w:color w:val="000000"/>
+                <w:sz w:val="16"/>
+              </w:rPr>
+              <w:t>Ajustada</w:t>
+            </w:r>
+          </w:p>
+        </w:tc>
+        <w:tc>
+          <w:tcPr>
+            <w:tcW w:w="2076" w:type="dxa"/>
+          </w:tcPr>
+          <w:p>
+            <w:pPr>
+              <w:rPr>
+                <w:rFonts w:ascii="Calibri" w:hAnsi="Calibri" w:cs="Arial"/>
+                <w:i/>
+                <w:color w:val="548DD4"/>
+                <w:sz w:val="18"/>
+                <w:szCs w:val="20"/>
+                <w:lang w:eastAsia="es-CL"/>
+              </w:rPr>
+            </w:pPr>
+            <w:r>
+              <w:rPr>
+                <w:rFonts w:ascii="Calibri" w:hAnsi="Calibri"/>
+                <w:color w:val="000000"/>
+                <w:sz w:val="16"/>
+              </w:rPr>
+              <w:t>Se precisaron los roles: Enzo Toledo (Backend), Patricio Finschi (Frontend y QA), Ramón Ortiz (Scrum Master y documentación).</w:t>
+            </w:r>
+          </w:p>
+        </w:tc>
+      </w:tr>
+      <w:tr>
+        <w:tc>
+          <w:tcPr>
+            <w:tcW w:w="1050" w:type="dxa"/>
+          </w:tcPr>
+          <w:p>
+            <w:pPr>
+              <w:rPr>
+                <w:b/>
+                <w:sz w:val="18"/>
+                <w:szCs w:val="24"/>
+              </w:rPr>
+            </w:pPr>
+            <w:r>
+              <w:rPr>
+                <w:rFonts w:ascii="Calibri" w:hAnsi="Calibri"/>
+                <w:color w:val="000000"/>
+                <w:sz w:val="16"/>
+              </w:rPr>
+              <w:t>Gestión de proyectos informáticos</w:t>
+            </w:r>
+          </w:p>
+        </w:tc>
+        <w:tc>
+          <w:tcPr>
+            <w:tcW w:w="1150" w:type="dxa"/>
+          </w:tcPr>
+          <w:p>
+            <w:pPr>
+              <w:rPr>
+                <w:rFonts w:ascii="Calibri" w:hAnsi="Calibri" w:cs="Arial"/>
+                <w:i/>
+                <w:color w:val="548DD4"/>
+                <w:sz w:val="18"/>
+                <w:szCs w:val="20"/>
+                <w:lang w:eastAsia="es-CL"/>
+              </w:rPr>
+            </w:pPr>
+            <w:r>
+              <w:rPr>
+                <w:rFonts w:ascii="Calibri" w:hAnsi="Calibri"/>
+                <w:color w:val="000000"/>
+                <w:sz w:val="16"/>
+              </w:rPr>
+              <w:t>Product Backlog</w:t>
+            </w:r>
+          </w:p>
+        </w:tc>
+        <w:tc>
+          <w:tcPr>
+            <w:tcW w:w="1100" w:type="dxa"/>
+          </w:tcPr>
+          <w:p>
+            <w:pPr>
+              <w:rPr>
+                <w:b/>
+                <w:sz w:val="18"/>
+                <w:szCs w:val="24"/>
+              </w:rPr>
+            </w:pPr>
+            <w:r>
+              <w:rPr>
+                <w:rFonts w:ascii="Calibri" w:hAnsi="Calibri"/>
+                <w:color w:val="000000"/>
+                <w:sz w:val="16"/>
+              </w:rPr>
+              <w:t>Tablero ágil (Trello)</w:t>
+            </w:r>
+          </w:p>
+        </w:tc>
+        <w:tc>
+          <w:tcPr>
+            <w:tcW w:w="900" w:type="dxa"/>
+          </w:tcPr>
+          <w:p>
+            <w:pPr>
+              <w:rPr>
+                <w:b/>
+                <w:sz w:val="18"/>
+                <w:szCs w:val="24"/>
+              </w:rPr>
+            </w:pPr>
+            <w:r>
+              <w:rPr>
+                <w:rFonts w:ascii="Calibri" w:hAnsi="Calibri"/>
+                <w:color w:val="000000"/>
+                <w:sz w:val="16"/>
+              </w:rPr>
+              <w:t>2 días</w:t>
+            </w:r>
+          </w:p>
+        </w:tc>
+        <w:tc>
+          <w:tcPr>
+            <w:tcW w:w="1150" w:type="dxa"/>
+          </w:tcPr>
+          <w:p>
+            <w:pPr>
+              <w:rPr>
+                <w:rFonts w:ascii="Calibri" w:hAnsi="Calibri" w:cs="Arial"/>
+                <w:i/>
+                <w:color w:val="548DD4"/>
+                <w:sz w:val="18"/>
+                <w:szCs w:val="20"/>
+                <w:lang w:eastAsia="es-CL"/>
+              </w:rPr>
+            </w:pPr>
+            <w:r>
+              <w:rPr>
+                <w:rFonts w:ascii="Calibri" w:hAnsi="Calibri"/>
+                <w:color w:val="000000"/>
+                <w:sz w:val="16"/>
+              </w:rPr>
+              <w:t>Equipo completo</w:t>
+            </w:r>
+          </w:p>
+        </w:tc>
+        <w:tc>
+          <w:tcPr>
+            <w:tcW w:w="1300" w:type="dxa"/>
+          </w:tcPr>
+          <w:p>
+            <w:pPr>
+              <w:rPr>
+                <w:rFonts w:ascii="Calibri" w:hAnsi="Calibri" w:cs="Arial"/>
+                <w:i/>
+                <w:color w:val="548DD4"/>
+                <w:sz w:val="18"/>
+                <w:szCs w:val="20"/>
+                <w:lang w:eastAsia="es-CL"/>
+              </w:rPr>
+            </w:pPr>
+            <w:r>
+              <w:rPr>
+                <w:rFonts w:ascii="Calibri" w:hAnsi="Calibri"/>
+                <w:color w:val="000000"/>
+                <w:sz w:val="16"/>
+              </w:rPr>
+              <w:t>17 HU con épicas, Story Points y criterios de aceptación.</w:t>
+            </w:r>
+          </w:p>
+        </w:tc>
+        <w:tc>
+          <w:tcPr>
+            <w:tcW w:w="1050" w:type="dxa"/>
+          </w:tcPr>
+          <w:p>
+            <w:pPr>
+              <w:rPr>
+                <w:rFonts w:ascii="Calibri" w:hAnsi="Calibri" w:cs="Arial"/>
+                <w:i/>
+                <w:color w:val="548DD4"/>
+                <w:sz w:val="18"/>
+                <w:szCs w:val="20"/>
+                <w:lang w:eastAsia="es-CL"/>
+              </w:rPr>
+            </w:pPr>
+            <w:r>
+              <w:rPr>
+                <w:rFonts w:ascii="Calibri" w:hAnsi="Calibri"/>
+                <w:color w:val="000000"/>
+                <w:sz w:val="16"/>
+              </w:rPr>
+              <w:t>Completado</w:t>
+            </w:r>
+          </w:p>
+        </w:tc>
+        <w:tc>
+          <w:tcPr>
+            <w:tcW w:w="2076" w:type="dxa"/>
+          </w:tcPr>
+          <w:p>
+            <w:pPr>
+              <w:rPr>
+                <w:rFonts w:ascii="Calibri" w:hAnsi="Calibri" w:cs="Arial"/>
+                <w:i/>
+                <w:color w:val="548DD4"/>
+                <w:sz w:val="18"/>
+                <w:szCs w:val="20"/>
+                <w:lang w:eastAsia="es-CL"/>
+              </w:rPr>
+            </w:pPr>
+          </w:p>
+        </w:tc>
+      </w:tr>
+      <w:tr>
+        <w:tc>
+          <w:tcPr>
+            <w:tcW w:w="1050" w:type="dxa"/>
+          </w:tcPr>
+          <w:p>
+            <w:pPr>
+              <w:rPr>
+                <w:b/>
+                <w:sz w:val="18"/>
+                <w:szCs w:val="24"/>
+              </w:rPr>
+            </w:pPr>
+            <w:r>
+              <w:rPr>
+                <w:rFonts w:ascii="Calibri" w:hAnsi="Calibri"/>
+                <w:color w:val="000000"/>
+                <w:sz w:val="16"/>
+              </w:rPr>
+              <w:t>Diseño y gestión de requisitos</w:t>
+            </w:r>
+          </w:p>
+        </w:tc>
+        <w:tc>
+          <w:tcPr>
+            <w:tcW w:w="1150" w:type="dxa"/>
+          </w:tcPr>
+          <w:p>
+            <w:pPr>
+              <w:rPr>
+                <w:rFonts w:ascii="Calibri" w:hAnsi="Calibri" w:cs="Arial"/>
+                <w:i/>
+                <w:color w:val="548DD4"/>
+                <w:sz w:val="18"/>
+                <w:szCs w:val="20"/>
+                <w:lang w:eastAsia="es-CL"/>
+              </w:rPr>
+            </w:pPr>
+            <w:r>
+              <w:rPr>
+                <w:rFonts w:ascii="Calibri" w:hAnsi="Calibri"/>
+                <w:color w:val="000000"/>
+                <w:sz w:val="16"/>
+              </w:rPr>
+              <w:t>Documentación ERS</w:t>
+            </w:r>
+          </w:p>
+        </w:tc>
+        <w:tc>
+          <w:tcPr>
+            <w:tcW w:w="1100" w:type="dxa"/>
+          </w:tcPr>
+          <w:p>
+            <w:pPr>
+              <w:rPr>
+                <w:b/>
+                <w:sz w:val="18"/>
+                <w:szCs w:val="24"/>
+              </w:rPr>
+            </w:pPr>
+            <w:r>
+              <w:rPr>
+                <w:rFonts w:ascii="Calibri" w:hAnsi="Calibri"/>
+                <w:color w:val="000000"/>
+                <w:sz w:val="16"/>
+              </w:rPr>
+              <w:t>Word, Markdown, GitHub</w:t>
+            </w:r>
+          </w:p>
+        </w:tc>
+        <w:tc>
+          <w:tcPr>
+            <w:tcW w:w="900" w:type="dxa"/>
+          </w:tcPr>
+          <w:p>
+            <w:pPr>
+              <w:rPr>
+                <w:b/>
+                <w:sz w:val="18"/>
+                <w:szCs w:val="24"/>
+              </w:rPr>
+            </w:pPr>
+            <w:r>
+              <w:rPr>
+                <w:rFonts w:ascii="Calibri" w:hAnsi="Calibri"/>
+                <w:color w:val="000000"/>
+                <w:sz w:val="16"/>
+              </w:rPr>
+              <w:t>1 semana</w:t>
+            </w:r>
+          </w:p>
+        </w:tc>
+        <w:tc>
+          <w:tcPr>
+            <w:tcW w:w="1150" w:type="dxa"/>
+          </w:tcPr>
+          <w:p>
+            <w:pPr>
+              <w:rPr>
+                <w:rFonts w:ascii="Calibri" w:hAnsi="Calibri" w:cs="Arial"/>
+                <w:i/>
+                <w:color w:val="548DD4"/>
+                <w:sz w:val="18"/>
+                <w:szCs w:val="20"/>
+                <w:lang w:eastAsia="es-CL"/>
+              </w:rPr>
+            </w:pPr>
+            <w:r>
+              <w:rPr>
+                <w:rFonts w:ascii="Calibri" w:hAnsi="Calibri"/>
+                <w:color w:val="000000"/>
+                <w:sz w:val="16"/>
+              </w:rPr>
+              <w:t>Equipo completo (Ramón Ortiz – documentación)</w:t>
+            </w:r>
+          </w:p>
+        </w:tc>
+        <w:tc>
+          <w:tcPr>
+            <w:tcW w:w="1300" w:type="dxa"/>
+          </w:tcPr>
+          <w:p>
+            <w:pPr>
+              <w:rPr>
+                <w:rFonts w:ascii="Calibri" w:hAnsi="Calibri" w:cs="Arial"/>
+                <w:i/>
+                <w:color w:val="548DD4"/>
+                <w:sz w:val="18"/>
+                <w:szCs w:val="20"/>
+                <w:lang w:eastAsia="es-CL"/>
+              </w:rPr>
+            </w:pPr>
+            <w:r>
+              <w:rPr>
+                <w:rFonts w:ascii="Calibri" w:hAnsi="Calibri"/>
+                <w:color w:val="000000"/>
+                <w:sz w:val="16"/>
+              </w:rPr>
+              <w:t>Facilitador: sirvió de base para validar cada HU.</w:t>
+            </w:r>
+          </w:p>
+        </w:tc>
+        <w:tc>
+          <w:tcPr>
+            <w:tcW w:w="1050" w:type="dxa"/>
+          </w:tcPr>
+          <w:p>
+            <w:pPr>
+              <w:rPr>
+                <w:rFonts w:ascii="Calibri" w:hAnsi="Calibri" w:cs="Arial"/>
+                <w:i/>
+                <w:color w:val="548DD4"/>
+                <w:sz w:val="18"/>
+                <w:szCs w:val="20"/>
+                <w:lang w:eastAsia="es-CL"/>
+              </w:rPr>
+            </w:pPr>
+            <w:r>
+              <w:rPr>
+                <w:rFonts w:ascii="Calibri" w:hAnsi="Calibri"/>
+                <w:color w:val="000000"/>
+                <w:sz w:val="16"/>
+              </w:rPr>
+              <w:t>Completado</w:t>
+            </w:r>
+          </w:p>
+        </w:tc>
+        <w:tc>
+          <w:tcPr>
+            <w:tcW w:w="2076" w:type="dxa"/>
+          </w:tcPr>
+          <w:p>
+            <w:pPr>
+              <w:rPr>
+                <w:rFonts w:ascii="Calibri" w:hAnsi="Calibri" w:cs="Arial"/>
+                <w:i/>
+                <w:color w:val="548DD4"/>
+                <w:sz w:val="18"/>
+                <w:szCs w:val="20"/>
+                <w:lang w:eastAsia="es-CL"/>
+              </w:rPr>
+            </w:pPr>
+          </w:p>
+        </w:tc>
+      </w:tr>
+      <w:tr>
+        <w:tc>
+          <w:tcPr>
+            <w:tcW w:w="1050" w:type="dxa"/>
+          </w:tcPr>
+          <w:p>
+            <w:pPr>
+              <w:rPr>
+                <w:b/>
+                <w:sz w:val="18"/>
+                <w:szCs w:val="24"/>
+              </w:rPr>
+            </w:pPr>
+            <w:r>
+              <w:rPr>
+                <w:rFonts w:ascii="Calibri" w:hAnsi="Calibri"/>
+                <w:color w:val="000000"/>
+                <w:sz w:val="16"/>
+              </w:rPr>
+              <w:t>Desarrollo de software</w:t>
+            </w:r>
+          </w:p>
+        </w:tc>
+        <w:tc>
+          <w:tcPr>
+            <w:tcW w:w="1150" w:type="dxa"/>
+          </w:tcPr>
+          <w:p>
+            <w:pPr>
+              <w:rPr>
+                <w:rFonts w:ascii="Calibri" w:hAnsi="Calibri" w:cs="Arial"/>
+                <w:i/>
+                <w:color w:val="548DD4"/>
+                <w:sz w:val="18"/>
+                <w:szCs w:val="20"/>
+                <w:lang w:eastAsia="es-CL"/>
+              </w:rPr>
+            </w:pPr>
+            <w:r>
+              <w:rPr>
+                <w:rFonts w:ascii="Calibri" w:hAnsi="Calibri"/>
+                <w:color w:val="000000"/>
+                <w:sz w:val="16"/>
+              </w:rPr>
+              <w:t>Sprint 0 – Configuración base</w:t>
+            </w:r>
+          </w:p>
+        </w:tc>
+        <w:tc>
+          <w:tcPr>
+            <w:tcW w:w="1100" w:type="dxa"/>
+          </w:tcPr>
+          <w:p>
+            <w:pPr>
+              <w:rPr>
+                <w:b/>
+                <w:sz w:val="18"/>
+                <w:szCs w:val="24"/>
+              </w:rPr>
+            </w:pPr>
+            <w:r>
+              <w:rPr>
+                <w:rFonts w:ascii="Calibri" w:hAnsi="Calibri"/>
+                <w:color w:val="000000"/>
+                <w:sz w:val="16"/>
+              </w:rPr>
+              <w:t>PostgreSQL / Supabase, Docker, GitHub, React</w:t>
+            </w:r>
+          </w:p>
+        </w:tc>
+        <w:tc>
+          <w:tcPr>
+            <w:tcW w:w="900" w:type="dxa"/>
+          </w:tcPr>
+          <w:p>
+            <w:pPr>
+              <w:rPr>
+                <w:b/>
+                <w:sz w:val="18"/>
+                <w:szCs w:val="24"/>
+              </w:rPr>
+            </w:pPr>
+            <w:r>
+              <w:rPr>
+                <w:rFonts w:ascii="Calibri" w:hAnsi="Calibri"/>
+                <w:color w:val="000000"/>
+                <w:sz w:val="16"/>
+              </w:rPr>
+              <w:t>2 semanas</w:t>
+            </w:r>
+          </w:p>
+        </w:tc>
+        <w:tc>
+          <w:tcPr>
+            <w:tcW w:w="1150" w:type="dxa"/>
+          </w:tcPr>
+          <w:p>
+            <w:pPr>
+              <w:rPr>
+                <w:rFonts w:ascii="Calibri" w:hAnsi="Calibri" w:cs="Arial"/>
+                <w:i/>
+                <w:color w:val="548DD4"/>
+                <w:sz w:val="18"/>
+                <w:szCs w:val="20"/>
+                <w:lang w:eastAsia="es-CL"/>
+              </w:rPr>
+            </w:pPr>
+            <w:r>
+              <w:rPr>
+                <w:rFonts w:ascii="Calibri" w:hAnsi="Calibri"/>
+                <w:color w:val="000000"/>
+                <w:sz w:val="16"/>
+              </w:rPr>
+              <w:t>Equipo completo (Enzo Toledo – Backend)</w:t>
+            </w:r>
+          </w:p>
+        </w:tc>
+        <w:tc>
+          <w:tcPr>
+            <w:tcW w:w="1300" w:type="dxa"/>
+          </w:tcPr>
+          <w:p>
+            <w:pPr>
+              <w:rPr>
+                <w:rFonts w:ascii="Calibri" w:hAnsi="Calibri" w:cs="Arial"/>
+                <w:i/>
+                <w:color w:val="548DD4"/>
+                <w:sz w:val="18"/>
+                <w:szCs w:val="20"/>
+                <w:lang w:eastAsia="es-CL"/>
+              </w:rPr>
+            </w:pPr>
+            <w:r>
+              <w:rPr>
+                <w:rFonts w:ascii="Calibri" w:hAnsi="Calibri"/>
+                <w:color w:val="000000"/>
+                <w:sz w:val="16"/>
+              </w:rPr>
+              <w:t>Dificultad: migrar la base a mitad del Sprint.</w:t>
+            </w:r>
+          </w:p>
+        </w:tc>
+        <w:tc>
+          <w:tcPr>
+            <w:tcW w:w="1050" w:type="dxa"/>
+          </w:tcPr>
+          <w:p>
+            <w:pPr>
+              <w:rPr>
+                <w:rFonts w:ascii="Calibri" w:hAnsi="Calibri" w:cs="Arial"/>
+                <w:i/>
+                <w:color w:val="548DD4"/>
+                <w:sz w:val="18"/>
+                <w:szCs w:val="20"/>
+                <w:lang w:eastAsia="es-CL"/>
+              </w:rPr>
+            </w:pPr>
+            <w:r>
+              <w:rPr>
+                <w:rFonts w:ascii="Calibri" w:hAnsi="Calibri"/>
+                <w:color w:val="000000"/>
+                <w:sz w:val="16"/>
+              </w:rPr>
+              <w:t>Completado / Ajustada</w:t>
+            </w:r>
+          </w:p>
+        </w:tc>
+        <w:tc>
+          <w:tcPr>
+            <w:tcW w:w="2076" w:type="dxa"/>
+          </w:tcPr>
+          <w:p>
+            <w:pPr>
+              <w:rPr>
+                <w:rFonts w:ascii="Calibri" w:hAnsi="Calibri" w:cs="Arial"/>
+                <w:i/>
+                <w:color w:val="548DD4"/>
+                <w:sz w:val="18"/>
+                <w:szCs w:val="20"/>
+                <w:lang w:eastAsia="es-CL"/>
+              </w:rPr>
+            </w:pPr>
+            <w:r>
+              <w:rPr>
+                <w:rFonts w:ascii="Calibri" w:hAnsi="Calibri"/>
+                <w:color w:val="000000"/>
+                <w:sz w:val="16"/>
+              </w:rPr>
+              <w:t xml:space="preserve">La base de datos pasó de un contenedor PostgreSQL a Supabase local con migraciones versionadas y RLS, y Docker Compose </w:t>
+            </w:r>
+            <w:r>
+              <w:rPr>
+                <w:rFonts w:ascii="Calibri" w:hAnsi="Calibri"/>
+                <w:color w:val="000000"/>
+                <w:sz w:val="16"/>
+              </w:rPr>
+              <w:lastRenderedPageBreak/>
+              <w:t>quedó separado para Front y Back.</w:t>
+            </w:r>
+          </w:p>
+        </w:tc>
+      </w:tr>
+      <w:tr>
+        <w:tc>
+          <w:tcPr>
+            <w:tcW w:w="1050" w:type="dxa"/>
+          </w:tcPr>
+          <w:p>
+            <w:pPr>
+              <w:rPr>
+                <w:b/>
+                <w:sz w:val="18"/>
+                <w:szCs w:val="24"/>
+              </w:rPr>
+            </w:pPr>
+            <w:r>
+              <w:rPr>
+                <w:rFonts w:ascii="Calibri" w:hAnsi="Calibri"/>
+                <w:color w:val="000000"/>
+                <w:sz w:val="16"/>
+              </w:rPr>
+              <w:lastRenderedPageBreak/>
+              <w:t>Desarrollo de software</w:t>
+            </w:r>
+          </w:p>
+        </w:tc>
+        <w:tc>
+          <w:tcPr>
+            <w:tcW w:w="1150" w:type="dxa"/>
+          </w:tcPr>
+          <w:p>
+            <w:pPr>
+              <w:rPr>
+                <w:rFonts w:ascii="Calibri" w:hAnsi="Calibri" w:cs="Arial"/>
+                <w:i/>
+                <w:color w:val="548DD4"/>
+                <w:sz w:val="18"/>
+                <w:szCs w:val="20"/>
+                <w:lang w:eastAsia="es-CL"/>
+              </w:rPr>
+            </w:pPr>
+            <w:r>
+              <w:rPr>
+                <w:rFonts w:ascii="Calibri" w:hAnsi="Calibri"/>
+                <w:color w:val="000000"/>
+                <w:sz w:val="16"/>
+              </w:rPr>
+              <w:t>Sprint 1 – Gestión de vehículos y fallas (HU01–HU06)</w:t>
+            </w:r>
+          </w:p>
+        </w:tc>
+        <w:tc>
+          <w:tcPr>
+            <w:tcW w:w="1100" w:type="dxa"/>
+          </w:tcPr>
+          <w:p>
+            <w:pPr>
+              <w:rPr>
+                <w:b/>
+                <w:sz w:val="18"/>
+                <w:szCs w:val="24"/>
+              </w:rPr>
+            </w:pPr>
+            <w:r>
+              <w:rPr>
+                <w:rFonts w:ascii="Calibri" w:hAnsi="Calibri"/>
+                <w:color w:val="000000"/>
+                <w:sz w:val="16"/>
+              </w:rPr>
+              <w:t>React, Node.js/Express, PostgreSQL, GitHub</w:t>
+            </w:r>
+          </w:p>
+        </w:tc>
+        <w:tc>
+          <w:tcPr>
+            <w:tcW w:w="900" w:type="dxa"/>
+          </w:tcPr>
+          <w:p>
+            <w:pPr>
+              <w:rPr>
+                <w:b/>
+                <w:sz w:val="18"/>
+                <w:szCs w:val="24"/>
+              </w:rPr>
+            </w:pPr>
+            <w:r>
+              <w:rPr>
+                <w:rFonts w:ascii="Calibri" w:hAnsi="Calibri"/>
+                <w:color w:val="000000"/>
+                <w:sz w:val="16"/>
+              </w:rPr>
+              <w:t>3 semanas</w:t>
+            </w:r>
+          </w:p>
+        </w:tc>
+        <w:tc>
+          <w:tcPr>
+            <w:tcW w:w="1150" w:type="dxa"/>
+          </w:tcPr>
+          <w:p>
+            <w:pPr>
+              <w:rPr>
+                <w:rFonts w:ascii="Calibri" w:hAnsi="Calibri" w:cs="Arial"/>
+                <w:i/>
+                <w:color w:val="548DD4"/>
+                <w:sz w:val="18"/>
+                <w:szCs w:val="20"/>
+                <w:lang w:eastAsia="es-CL"/>
+              </w:rPr>
+            </w:pPr>
+            <w:r>
+              <w:rPr>
+                <w:rFonts w:ascii="Calibri" w:hAnsi="Calibri"/>
+                <w:color w:val="000000"/>
+                <w:sz w:val="16"/>
+              </w:rPr>
+              <w:t>Patricio Finschi (Frontend) / Enzo Toledo (Backend)</w:t>
+            </w:r>
+          </w:p>
+        </w:tc>
+        <w:tc>
+          <w:tcPr>
+            <w:tcW w:w="1300" w:type="dxa"/>
+          </w:tcPr>
+          <w:p>
+            <w:pPr>
+              <w:rPr>
+                <w:rFonts w:ascii="Calibri" w:hAnsi="Calibri" w:cs="Arial"/>
+                <w:i/>
+                <w:color w:val="548DD4"/>
+                <w:sz w:val="18"/>
+                <w:szCs w:val="20"/>
+                <w:lang w:eastAsia="es-CL"/>
+              </w:rPr>
+            </w:pPr>
+            <w:r>
+              <w:rPr>
+                <w:rFonts w:ascii="Calibri" w:hAnsi="Calibri"/>
+                <w:color w:val="000000"/>
+                <w:sz w:val="16"/>
+              </w:rPr>
+              <w:t>Facilitador: prototipo previo y modelo de datos validado.</w:t>
+            </w:r>
+          </w:p>
+        </w:tc>
+        <w:tc>
+          <w:tcPr>
+            <w:tcW w:w="1050" w:type="dxa"/>
+          </w:tcPr>
+          <w:p>
+            <w:pPr>
+              <w:rPr>
+                <w:rFonts w:ascii="Calibri" w:hAnsi="Calibri" w:cs="Arial"/>
+                <w:i/>
+                <w:color w:val="548DD4"/>
+                <w:sz w:val="18"/>
+                <w:szCs w:val="20"/>
+                <w:lang w:eastAsia="es-CL"/>
+              </w:rPr>
+            </w:pPr>
+            <w:r>
+              <w:rPr>
+                <w:rFonts w:ascii="Calibri" w:hAnsi="Calibri"/>
+                <w:color w:val="000000"/>
+                <w:sz w:val="16"/>
+              </w:rPr>
+              <w:t>Completado</w:t>
+            </w:r>
+          </w:p>
+        </w:tc>
+        <w:tc>
+          <w:tcPr>
+            <w:tcW w:w="2076" w:type="dxa"/>
+          </w:tcPr>
+          <w:p>
+            <w:pPr>
+              <w:rPr>
+                <w:rFonts w:ascii="Calibri" w:hAnsi="Calibri" w:cs="Arial"/>
+                <w:i/>
+                <w:color w:val="548DD4"/>
+                <w:sz w:val="18"/>
+                <w:szCs w:val="20"/>
+                <w:lang w:eastAsia="es-CL"/>
+              </w:rPr>
+            </w:pPr>
+            <w:r>
+              <w:rPr>
+                <w:rFonts w:ascii="Calibri" w:hAnsi="Calibri"/>
+                <w:color w:val="000000"/>
+                <w:sz w:val="16"/>
+              </w:rPr>
+              <w:t>Se agregó la derivación de fallas Teniente → Inspector (HU06).</w:t>
+            </w:r>
+          </w:p>
+        </w:tc>
+      </w:tr>
+      <w:tr>
+        <w:tc>
+          <w:tcPr>
+            <w:tcW w:w="1050" w:type="dxa"/>
+          </w:tcPr>
+          <w:p>
+            <w:pPr>
+              <w:rPr>
+                <w:b/>
+                <w:sz w:val="18"/>
+                <w:szCs w:val="24"/>
+              </w:rPr>
+            </w:pPr>
+            <w:r>
+              <w:rPr>
+                <w:rFonts w:ascii="Calibri" w:hAnsi="Calibri"/>
+                <w:color w:val="000000"/>
+                <w:sz w:val="16"/>
+              </w:rPr>
+              <w:t>Desarrollo de software</w:t>
+            </w:r>
+          </w:p>
+        </w:tc>
+        <w:tc>
+          <w:tcPr>
+            <w:tcW w:w="1150" w:type="dxa"/>
+          </w:tcPr>
+          <w:p>
+            <w:pPr>
+              <w:rPr>
+                <w:rFonts w:ascii="Calibri" w:hAnsi="Calibri" w:cs="Arial"/>
+                <w:i/>
+                <w:color w:val="548DD4"/>
+                <w:sz w:val="18"/>
+                <w:szCs w:val="20"/>
+                <w:lang w:eastAsia="es-CL"/>
+              </w:rPr>
+            </w:pPr>
+            <w:r>
+              <w:rPr>
+                <w:rFonts w:ascii="Calibri" w:hAnsi="Calibri"/>
+                <w:color w:val="000000"/>
+                <w:sz w:val="16"/>
+              </w:rPr>
+              <w:t>Sprint 2 – Mantenciones y alertas (HU07–HU11)</w:t>
+            </w:r>
+          </w:p>
+        </w:tc>
+        <w:tc>
+          <w:tcPr>
+            <w:tcW w:w="1100" w:type="dxa"/>
+          </w:tcPr>
+          <w:p>
+            <w:pPr>
+              <w:rPr>
+                <w:b/>
+                <w:sz w:val="18"/>
+                <w:szCs w:val="24"/>
+              </w:rPr>
+            </w:pPr>
+            <w:r>
+              <w:rPr>
+                <w:rFonts w:ascii="Calibri" w:hAnsi="Calibri"/>
+                <w:color w:val="000000"/>
+                <w:sz w:val="16"/>
+              </w:rPr>
+              <w:t>React, Node.js/Express, PostgreSQL</w:t>
+            </w:r>
+          </w:p>
+        </w:tc>
+        <w:tc>
+          <w:tcPr>
+            <w:tcW w:w="900" w:type="dxa"/>
+          </w:tcPr>
+          <w:p>
+            <w:pPr>
+              <w:rPr>
+                <w:b/>
+                <w:sz w:val="18"/>
+                <w:szCs w:val="24"/>
+              </w:rPr>
+            </w:pPr>
+            <w:r>
+              <w:rPr>
+                <w:rFonts w:ascii="Calibri" w:hAnsi="Calibri"/>
+                <w:color w:val="000000"/>
+                <w:sz w:val="16"/>
+              </w:rPr>
+              <w:t>3 semanas</w:t>
+            </w:r>
+          </w:p>
+        </w:tc>
+        <w:tc>
+          <w:tcPr>
+            <w:tcW w:w="1150" w:type="dxa"/>
+          </w:tcPr>
+          <w:p>
+            <w:pPr>
+              <w:rPr>
+                <w:rFonts w:ascii="Calibri" w:hAnsi="Calibri" w:cs="Arial"/>
+                <w:i/>
+                <w:color w:val="548DD4"/>
+                <w:sz w:val="18"/>
+                <w:szCs w:val="20"/>
+                <w:lang w:eastAsia="es-CL"/>
+              </w:rPr>
+            </w:pPr>
+            <w:r>
+              <w:rPr>
+                <w:rFonts w:ascii="Calibri" w:hAnsi="Calibri"/>
+                <w:color w:val="000000"/>
+                <w:sz w:val="16"/>
+              </w:rPr>
+              <w:t>Patricio Finschi (Frontend) / Enzo Toledo (Backend)</w:t>
+            </w:r>
+          </w:p>
+        </w:tc>
+        <w:tc>
+          <w:tcPr>
+            <w:tcW w:w="1300" w:type="dxa"/>
+          </w:tcPr>
+          <w:p>
+            <w:pPr>
+              <w:rPr>
+                <w:rFonts w:ascii="Calibri" w:hAnsi="Calibri" w:cs="Arial"/>
+                <w:i/>
+                <w:color w:val="548DD4"/>
+                <w:sz w:val="18"/>
+                <w:szCs w:val="20"/>
+                <w:lang w:eastAsia="es-CL"/>
+              </w:rPr>
+            </w:pPr>
+            <w:r>
+              <w:rPr>
+                <w:rFonts w:ascii="Calibri" w:hAnsi="Calibri"/>
+                <w:color w:val="000000"/>
+                <w:sz w:val="16"/>
+              </w:rPr>
+              <w:t>Dificultad: reglas de estado del vehículo y manejo de fechas.</w:t>
+            </w:r>
+          </w:p>
+        </w:tc>
+        <w:tc>
+          <w:tcPr>
+            <w:tcW w:w="1050" w:type="dxa"/>
+          </w:tcPr>
+          <w:p>
+            <w:pPr>
+              <w:rPr>
+                <w:rFonts w:ascii="Calibri" w:hAnsi="Calibri" w:cs="Arial"/>
+                <w:i/>
+                <w:color w:val="548DD4"/>
+                <w:sz w:val="18"/>
+                <w:szCs w:val="20"/>
+                <w:lang w:eastAsia="es-CL"/>
+              </w:rPr>
+            </w:pPr>
+            <w:r>
+              <w:rPr>
+                <w:rFonts w:ascii="Calibri" w:hAnsi="Calibri"/>
+                <w:color w:val="000000"/>
+                <w:sz w:val="16"/>
+              </w:rPr>
+              <w:t>En curso</w:t>
+            </w:r>
+          </w:p>
+        </w:tc>
+        <w:tc>
+          <w:tcPr>
+            <w:tcW w:w="2076" w:type="dxa"/>
+          </w:tcPr>
+          <w:p>
+            <w:pPr>
+              <w:rPr>
+                <w:rFonts w:ascii="Calibri" w:hAnsi="Calibri" w:cs="Arial"/>
+                <w:i/>
+                <w:color w:val="548DD4"/>
+                <w:sz w:val="18"/>
+                <w:szCs w:val="20"/>
+                <w:lang w:eastAsia="es-CL"/>
+              </w:rPr>
+            </w:pPr>
+            <w:r>
+              <w:rPr>
+                <w:rFonts w:ascii="Calibri" w:hAnsi="Calibri"/>
+                <w:color w:val="000000"/>
+                <w:sz w:val="16"/>
+              </w:rPr>
+              <w:t>Notificaciones como avisos dentro del sistema (dashboard, alertas, contador) en vez de correo/SMS, que quedan fuera del alcance.</w:t>
+            </w:r>
+          </w:p>
+        </w:tc>
+      </w:tr>
+      <w:tr>
+        <w:tc>
+          <w:tcPr>
+            <w:tcW w:w="1050" w:type="dxa"/>
+          </w:tcPr>
+          <w:p>
+            <w:pPr>
+              <w:rPr>
+                <w:b/>
+                <w:sz w:val="18"/>
+                <w:szCs w:val="24"/>
+              </w:rPr>
+            </w:pPr>
+            <w:r>
+              <w:rPr>
+                <w:rFonts w:ascii="Calibri" w:hAnsi="Calibri"/>
+                <w:color w:val="000000"/>
+                <w:sz w:val="16"/>
+              </w:rPr>
+              <w:t>Desarrollo de software / Seguridad en sistemas computacionales</w:t>
+            </w:r>
+          </w:p>
+        </w:tc>
+        <w:tc>
+          <w:tcPr>
+            <w:tcW w:w="1150" w:type="dxa"/>
+          </w:tcPr>
+          <w:p>
+            <w:pPr>
+              <w:rPr>
+                <w:rFonts w:ascii="Calibri" w:hAnsi="Calibri" w:cs="Arial"/>
+                <w:i/>
+                <w:color w:val="548DD4"/>
+                <w:sz w:val="18"/>
+                <w:szCs w:val="20"/>
+                <w:lang w:eastAsia="es-CL"/>
+              </w:rPr>
+            </w:pPr>
+            <w:r>
+              <w:rPr>
+                <w:rFonts w:ascii="Calibri" w:hAnsi="Calibri"/>
+                <w:color w:val="000000"/>
+                <w:sz w:val="16"/>
+              </w:rPr>
+              <w:t>Sprint 3 – Reportería, costos y usuarios (HU12–HU17)</w:t>
+            </w:r>
+          </w:p>
+        </w:tc>
+        <w:tc>
+          <w:tcPr>
+            <w:tcW w:w="1100" w:type="dxa"/>
+          </w:tcPr>
+          <w:p>
+            <w:pPr>
+              <w:rPr>
+                <w:b/>
+                <w:sz w:val="18"/>
+                <w:szCs w:val="24"/>
+              </w:rPr>
+            </w:pPr>
+            <w:r>
+              <w:rPr>
+                <w:rFonts w:ascii="Calibri" w:hAnsi="Calibri"/>
+                <w:color w:val="000000"/>
+                <w:sz w:val="16"/>
+              </w:rPr>
+              <w:t>React, jsPDF, PostgreSQL, JWT, bcrypt</w:t>
+            </w:r>
+          </w:p>
+        </w:tc>
+        <w:tc>
+          <w:tcPr>
+            <w:tcW w:w="900" w:type="dxa"/>
+          </w:tcPr>
+          <w:p>
+            <w:pPr>
+              <w:rPr>
+                <w:b/>
+                <w:sz w:val="18"/>
+                <w:szCs w:val="24"/>
+              </w:rPr>
+            </w:pPr>
+            <w:r>
+              <w:rPr>
+                <w:rFonts w:ascii="Calibri" w:hAnsi="Calibri"/>
+                <w:color w:val="000000"/>
+                <w:sz w:val="16"/>
+              </w:rPr>
+              <w:t>3 semanas</w:t>
+            </w:r>
+          </w:p>
+        </w:tc>
+        <w:tc>
+          <w:tcPr>
+            <w:tcW w:w="1150" w:type="dxa"/>
+          </w:tcPr>
+          <w:p>
+            <w:pPr>
+              <w:rPr>
+                <w:rFonts w:ascii="Calibri" w:hAnsi="Calibri" w:cs="Arial"/>
+                <w:i/>
+                <w:color w:val="548DD4"/>
+                <w:sz w:val="18"/>
+                <w:szCs w:val="20"/>
+                <w:lang w:eastAsia="es-CL"/>
+              </w:rPr>
+            </w:pPr>
+            <w:r>
+              <w:rPr>
+                <w:rFonts w:ascii="Calibri" w:hAnsi="Calibri"/>
+                <w:color w:val="000000"/>
+                <w:sz w:val="16"/>
+              </w:rPr>
+              <w:t>Patricio Finschi (Frontend) / Enzo Toledo (Backend)</w:t>
+            </w:r>
+          </w:p>
+        </w:tc>
+        <w:tc>
+          <w:tcPr>
+            <w:tcW w:w="1300" w:type="dxa"/>
+          </w:tcPr>
+          <w:p>
+            <w:pPr>
+              <w:rPr>
+                <w:rFonts w:ascii="Calibri" w:hAnsi="Calibri" w:cs="Arial"/>
+                <w:i/>
+                <w:color w:val="548DD4"/>
+                <w:sz w:val="18"/>
+                <w:szCs w:val="20"/>
+                <w:lang w:eastAsia="es-CL"/>
+              </w:rPr>
+            </w:pPr>
+            <w:r>
+              <w:rPr>
+                <w:rFonts w:ascii="Calibri" w:hAnsi="Calibri"/>
+                <w:color w:val="000000"/>
+                <w:sz w:val="16"/>
+              </w:rPr>
+              <w:t>Facilitador: los datos de costos ya estaban estructurados.</w:t>
+            </w:r>
+          </w:p>
+        </w:tc>
+        <w:tc>
+          <w:tcPr>
+            <w:tcW w:w="1050" w:type="dxa"/>
+          </w:tcPr>
+          <w:p>
+            <w:pPr>
+              <w:rPr>
+                <w:rFonts w:ascii="Calibri" w:hAnsi="Calibri" w:cs="Arial"/>
+                <w:i/>
+                <w:color w:val="548DD4"/>
+                <w:sz w:val="18"/>
+                <w:szCs w:val="20"/>
+                <w:lang w:eastAsia="es-CL"/>
+              </w:rPr>
+            </w:pPr>
+            <w:r>
+              <w:rPr>
+                <w:rFonts w:ascii="Calibri" w:hAnsi="Calibri"/>
+                <w:color w:val="000000"/>
+                <w:sz w:val="16"/>
+              </w:rPr>
+              <w:t>En curso</w:t>
+            </w:r>
+          </w:p>
+        </w:tc>
+        <w:tc>
+          <w:tcPr>
+            <w:tcW w:w="2076" w:type="dxa"/>
+          </w:tcPr>
+          <w:p>
+            <w:pPr>
+              <w:rPr>
+                <w:rFonts w:ascii="Calibri" w:hAnsi="Calibri" w:cs="Arial"/>
+                <w:i/>
+                <w:color w:val="548DD4"/>
+                <w:sz w:val="18"/>
+                <w:szCs w:val="20"/>
+                <w:lang w:eastAsia="es-CL"/>
+              </w:rPr>
+            </w:pPr>
+            <w:r>
+              <w:rPr>
+                <w:rFonts w:ascii="Calibri" w:hAnsi="Calibri"/>
+                <w:color w:val="000000"/>
+                <w:sz w:val="16"/>
+              </w:rPr>
+              <w:t>Se adelantaron HU12, HU13, la gestión de usuarios y la seguridad por rol y compañía.</w:t>
+            </w:r>
+          </w:p>
+        </w:tc>
+      </w:tr>
+      <w:tr>
+        <w:tc>
+          <w:tcPr>
+            <w:tcW w:w="1050" w:type="dxa"/>
+          </w:tcPr>
+          <w:p>
+            <w:pPr>
+              <w:rPr>
+                <w:b/>
+                <w:sz w:val="18"/>
+                <w:szCs w:val="24"/>
+              </w:rPr>
+            </w:pPr>
+            <w:r>
+              <w:rPr>
+                <w:rFonts w:ascii="Calibri" w:hAnsi="Calibri"/>
+                <w:color w:val="000000"/>
+                <w:sz w:val="16"/>
+              </w:rPr>
+              <w:t>Calidad de software</w:t>
+            </w:r>
+          </w:p>
+        </w:tc>
+        <w:tc>
+          <w:tcPr>
+            <w:tcW w:w="1150" w:type="dxa"/>
+          </w:tcPr>
+          <w:p>
+            <w:pPr>
+              <w:rPr>
+                <w:rFonts w:ascii="Calibri" w:hAnsi="Calibri" w:cs="Arial"/>
+                <w:i/>
+                <w:color w:val="548DD4"/>
+                <w:sz w:val="18"/>
+                <w:szCs w:val="20"/>
+                <w:lang w:eastAsia="es-CL"/>
+              </w:rPr>
+            </w:pPr>
+            <w:r>
+              <w:rPr>
+                <w:rFonts w:ascii="Calibri" w:hAnsi="Calibri"/>
+                <w:color w:val="000000"/>
+                <w:sz w:val="16"/>
+              </w:rPr>
+              <w:t>Ejecución del plan de pruebas</w:t>
+            </w:r>
+          </w:p>
+        </w:tc>
+        <w:tc>
+          <w:tcPr>
+            <w:tcW w:w="1100" w:type="dxa"/>
+          </w:tcPr>
+          <w:p>
+            <w:pPr>
+              <w:rPr>
+                <w:b/>
+                <w:sz w:val="18"/>
+                <w:szCs w:val="24"/>
+              </w:rPr>
+            </w:pPr>
+            <w:r>
+              <w:rPr>
+                <w:rFonts w:ascii="Calibri" w:hAnsi="Calibri"/>
+                <w:color w:val="000000"/>
+                <w:sz w:val="16"/>
+              </w:rPr>
+              <w:t>Jest, Supertest, Cypress</w:t>
+            </w:r>
+          </w:p>
+        </w:tc>
+        <w:tc>
+          <w:tcPr>
+            <w:tcW w:w="900" w:type="dxa"/>
+          </w:tcPr>
+          <w:p>
+            <w:pPr>
+              <w:rPr>
+                <w:b/>
+                <w:sz w:val="18"/>
+                <w:szCs w:val="24"/>
+              </w:rPr>
+            </w:pPr>
+            <w:r>
+              <w:rPr>
+                <w:rFonts w:ascii="Calibri" w:hAnsi="Calibri"/>
+                <w:color w:val="000000"/>
+                <w:sz w:val="16"/>
+              </w:rPr>
+              <w:t>1 semana</w:t>
+            </w:r>
+          </w:p>
+        </w:tc>
+        <w:tc>
+          <w:tcPr>
+            <w:tcW w:w="1150" w:type="dxa"/>
+          </w:tcPr>
+          <w:p>
+            <w:pPr>
+              <w:rPr>
+                <w:rFonts w:ascii="Calibri" w:hAnsi="Calibri" w:cs="Arial"/>
+                <w:i/>
+                <w:color w:val="548DD4"/>
+                <w:sz w:val="18"/>
+                <w:szCs w:val="20"/>
+                <w:lang w:eastAsia="es-CL"/>
+              </w:rPr>
+            </w:pPr>
+            <w:r>
+              <w:rPr>
+                <w:rFonts w:ascii="Calibri" w:hAnsi="Calibri"/>
+                <w:color w:val="000000"/>
+                <w:sz w:val="16"/>
+              </w:rPr>
+              <w:t>Patricio Finschi (QA)</w:t>
+            </w:r>
+          </w:p>
+        </w:tc>
+        <w:tc>
+          <w:tcPr>
+            <w:tcW w:w="1300" w:type="dxa"/>
+          </w:tcPr>
+          <w:p>
+            <w:pPr>
+              <w:rPr>
+                <w:rFonts w:ascii="Calibri" w:hAnsi="Calibri" w:cs="Arial"/>
+                <w:i/>
+                <w:color w:val="548DD4"/>
+                <w:sz w:val="18"/>
+                <w:szCs w:val="20"/>
+                <w:lang w:eastAsia="es-CL"/>
+              </w:rPr>
+            </w:pPr>
+            <w:r>
+              <w:rPr>
+                <w:rFonts w:ascii="Calibri" w:hAnsi="Calibri"/>
+                <w:color w:val="000000"/>
+                <w:sz w:val="16"/>
+              </w:rPr>
+              <w:t>Dificultad: aprender las herramientas de pruebas automatizadas.</w:t>
+            </w:r>
+          </w:p>
+        </w:tc>
+        <w:tc>
+          <w:tcPr>
+            <w:tcW w:w="1050" w:type="dxa"/>
+          </w:tcPr>
+          <w:p>
+            <w:pPr>
+              <w:rPr>
+                <w:rFonts w:ascii="Calibri" w:hAnsi="Calibri" w:cs="Arial"/>
+                <w:i/>
+                <w:color w:val="548DD4"/>
+                <w:sz w:val="18"/>
+                <w:szCs w:val="20"/>
+                <w:lang w:eastAsia="es-CL"/>
+              </w:rPr>
+            </w:pPr>
+            <w:r>
+              <w:rPr>
+                <w:rFonts w:ascii="Calibri" w:hAnsi="Calibri"/>
+                <w:color w:val="000000"/>
+                <w:sz w:val="16"/>
+              </w:rPr>
+              <w:t>No iniciado</w:t>
+            </w:r>
+          </w:p>
+        </w:tc>
+        <w:tc>
+          <w:tcPr>
+            <w:tcW w:w="2076" w:type="dxa"/>
+          </w:tcPr>
+          <w:p>
+            <w:pPr>
+              <w:rPr>
+                <w:rFonts w:ascii="Calibri" w:hAnsi="Calibri" w:cs="Arial"/>
+                <w:i/>
+                <w:color w:val="548DD4"/>
+                <w:sz w:val="18"/>
+                <w:szCs w:val="20"/>
+                <w:lang w:eastAsia="es-CL"/>
+              </w:rPr>
+            </w:pPr>
+            <w:r>
+              <w:rPr>
+                <w:rFonts w:ascii="Calibri" w:hAnsi="Calibri"/>
+                <w:color w:val="000000"/>
+                <w:sz w:val="16"/>
+              </w:rPr>
+              <w:t>Mientras tanto, cada HU se prueba manualmente con sus criterios de aceptación.</w:t>
+            </w:r>
+          </w:p>
+        </w:tc>
+      </w:tr>
+      <w:tr>
+        <w:tc>
+          <w:tcPr>
+            <w:tcW w:w="1050" w:type="dxa"/>
+          </w:tcPr>
+          <w:p>
+            <w:pPr>
+              <w:rPr>
+                <w:b/>
+                <w:sz w:val="18"/>
+                <w:szCs w:val="24"/>
+              </w:rPr>
+            </w:pPr>
+            <w:r>
+              <w:rPr>
+                <w:rFonts w:ascii="Calibri" w:hAnsi="Calibri"/>
+                <w:color w:val="000000"/>
+                <w:sz w:val="16"/>
+              </w:rPr>
+              <w:t>Integración de plataformas</w:t>
+            </w:r>
+          </w:p>
+        </w:tc>
+        <w:tc>
+          <w:tcPr>
+            <w:tcW w:w="1150" w:type="dxa"/>
+          </w:tcPr>
+          <w:p>
+            <w:pPr>
+              <w:rPr>
+                <w:rFonts w:ascii="Calibri" w:hAnsi="Calibri" w:cs="Arial"/>
+                <w:i/>
+                <w:color w:val="548DD4"/>
+                <w:sz w:val="18"/>
+                <w:szCs w:val="20"/>
+                <w:lang w:eastAsia="es-CL"/>
+              </w:rPr>
+            </w:pPr>
+            <w:r>
+              <w:rPr>
+                <w:rFonts w:ascii="Calibri" w:hAnsi="Calibri"/>
+                <w:color w:val="000000"/>
+                <w:sz w:val="16"/>
+              </w:rPr>
+              <w:t>Contenerización y despliegue</w:t>
+            </w:r>
+          </w:p>
+        </w:tc>
+        <w:tc>
+          <w:tcPr>
+            <w:tcW w:w="1100" w:type="dxa"/>
+          </w:tcPr>
+          <w:p>
+            <w:pPr>
+              <w:rPr>
+                <w:b/>
+                <w:sz w:val="18"/>
+                <w:szCs w:val="24"/>
+              </w:rPr>
+            </w:pPr>
+            <w:r>
+              <w:rPr>
+                <w:rFonts w:ascii="Calibri" w:hAnsi="Calibri"/>
+                <w:color w:val="000000"/>
+                <w:sz w:val="16"/>
+              </w:rPr>
+              <w:t>Docker, Docker Compose, Nginx</w:t>
+            </w:r>
+          </w:p>
+        </w:tc>
+        <w:tc>
+          <w:tcPr>
+            <w:tcW w:w="900" w:type="dxa"/>
+          </w:tcPr>
+          <w:p>
+            <w:pPr>
+              <w:rPr>
+                <w:b/>
+                <w:sz w:val="18"/>
+                <w:szCs w:val="24"/>
+              </w:rPr>
+            </w:pPr>
+            <w:r>
+              <w:rPr>
+                <w:rFonts w:ascii="Calibri" w:hAnsi="Calibri"/>
+                <w:color w:val="000000"/>
+                <w:sz w:val="16"/>
+              </w:rPr>
+              <w:t>1 semana</w:t>
+            </w:r>
+          </w:p>
+        </w:tc>
+        <w:tc>
+          <w:tcPr>
+            <w:tcW w:w="1150" w:type="dxa"/>
+          </w:tcPr>
+          <w:p>
+            <w:pPr>
+              <w:rPr>
+                <w:rFonts w:ascii="Calibri" w:hAnsi="Calibri" w:cs="Arial"/>
+                <w:i/>
+                <w:color w:val="548DD4"/>
+                <w:sz w:val="18"/>
+                <w:szCs w:val="20"/>
+                <w:lang w:eastAsia="es-CL"/>
+              </w:rPr>
+            </w:pPr>
+            <w:r>
+              <w:rPr>
+                <w:rFonts w:ascii="Calibri" w:hAnsi="Calibri"/>
+                <w:color w:val="000000"/>
+                <w:sz w:val="16"/>
+              </w:rPr>
+              <w:t>Equipo completo</w:t>
+            </w:r>
+          </w:p>
+        </w:tc>
+        <w:tc>
+          <w:tcPr>
+            <w:tcW w:w="1300" w:type="dxa"/>
+          </w:tcPr>
+          <w:p>
+            <w:pPr>
+              <w:rPr>
+                <w:rFonts w:ascii="Calibri" w:hAnsi="Calibri" w:cs="Arial"/>
+                <w:i/>
+                <w:color w:val="548DD4"/>
+                <w:sz w:val="18"/>
+                <w:szCs w:val="20"/>
+                <w:lang w:eastAsia="es-CL"/>
+              </w:rPr>
+            </w:pPr>
+            <w:r>
+              <w:rPr>
+                <w:rFonts w:ascii="Calibri" w:hAnsi="Calibri"/>
+                <w:color w:val="000000"/>
+                <w:sz w:val="16"/>
+              </w:rPr>
+              <w:t>Dificultad: el equipo no tiene experiencia en despliegue a producción.</w:t>
+            </w:r>
+          </w:p>
+        </w:tc>
+        <w:tc>
+          <w:tcPr>
+            <w:tcW w:w="1050" w:type="dxa"/>
+          </w:tcPr>
+          <w:p>
+            <w:pPr>
+              <w:rPr>
+                <w:rFonts w:ascii="Calibri" w:hAnsi="Calibri" w:cs="Arial"/>
+                <w:i/>
+                <w:color w:val="548DD4"/>
+                <w:sz w:val="18"/>
+                <w:szCs w:val="20"/>
+                <w:lang w:eastAsia="es-CL"/>
+              </w:rPr>
+            </w:pPr>
+            <w:r>
+              <w:rPr>
+                <w:rFonts w:ascii="Calibri" w:hAnsi="Calibri"/>
+                <w:color w:val="000000"/>
+                <w:sz w:val="16"/>
+              </w:rPr>
+              <w:t>En curso</w:t>
+            </w:r>
+          </w:p>
+        </w:tc>
+        <w:tc>
+          <w:tcPr>
+            <w:tcW w:w="2076" w:type="dxa"/>
+          </w:tcPr>
+          <w:p>
+            <w:pPr>
+              <w:rPr>
+                <w:rFonts w:ascii="Calibri" w:hAnsi="Calibri" w:cs="Arial"/>
+                <w:i/>
+                <w:color w:val="548DD4"/>
+                <w:sz w:val="18"/>
+                <w:szCs w:val="20"/>
+                <w:lang w:eastAsia="es-CL"/>
+              </w:rPr>
+            </w:pPr>
+            <w:r>
+              <w:rPr>
+                <w:rFonts w:ascii="Calibri" w:hAnsi="Calibri"/>
+                <w:color w:val="000000"/>
+                <w:sz w:val="16"/>
+              </w:rPr>
+              <w:t>Se reemplazó Vercel por Docker (Nginx en producción). Los compose de desarrollo y producción ya están listos; falta el servidor.</w:t>
+            </w:r>
+          </w:p>
+        </w:tc>
+      </w:tr>
+      <w:tr>
+        <w:tc>
+          <w:tcPr>
+            <w:tcW w:w="1050" w:type="dxa"/>
+          </w:tcPr>
+          <w:p>
+            <w:pPr>
+              <w:rPr>
+                <w:b/>
+                <w:sz w:val="18"/>
+                <w:szCs w:val="24"/>
+              </w:rPr>
+            </w:pPr>
+            <w:r>
+              <w:rPr>
+                <w:rFonts w:ascii="Calibri" w:hAnsi="Calibri"/>
+                <w:color w:val="000000"/>
+                <w:sz w:val="16"/>
+              </w:rPr>
+              <w:t>Gestión de proyectos informáticos</w:t>
+            </w:r>
+          </w:p>
+        </w:tc>
+        <w:tc>
+          <w:tcPr>
+            <w:tcW w:w="1150" w:type="dxa"/>
+          </w:tcPr>
+          <w:p>
+            <w:pPr>
+              <w:rPr>
+                <w:rFonts w:ascii="Calibri" w:hAnsi="Calibri" w:cs="Arial"/>
+                <w:i/>
+                <w:color w:val="548DD4"/>
+                <w:sz w:val="18"/>
+                <w:szCs w:val="20"/>
+                <w:lang w:eastAsia="es-CL"/>
+              </w:rPr>
+            </w:pPr>
+            <w:r>
+              <w:rPr>
+                <w:rFonts w:ascii="Calibri" w:hAnsi="Calibri"/>
+                <w:color w:val="000000"/>
+                <w:sz w:val="16"/>
+              </w:rPr>
+              <w:t>Presentación de la solución informática</w:t>
+            </w:r>
+          </w:p>
+        </w:tc>
+        <w:tc>
+          <w:tcPr>
+            <w:tcW w:w="1100" w:type="dxa"/>
+          </w:tcPr>
+          <w:p>
+            <w:pPr>
+              <w:rPr>
+                <w:b/>
+                <w:sz w:val="18"/>
+                <w:szCs w:val="24"/>
+              </w:rPr>
+            </w:pPr>
+            <w:r>
+              <w:rPr>
+                <w:rFonts w:ascii="Calibri" w:hAnsi="Calibri"/>
+                <w:color w:val="000000"/>
+                <w:sz w:val="16"/>
+              </w:rPr>
+              <w:t>PowerPoint, aplicación funcionando</w:t>
+            </w:r>
+          </w:p>
+        </w:tc>
+        <w:tc>
+          <w:tcPr>
+            <w:tcW w:w="900" w:type="dxa"/>
+          </w:tcPr>
+          <w:p>
+            <w:pPr>
+              <w:rPr>
+                <w:b/>
+                <w:sz w:val="18"/>
+                <w:szCs w:val="24"/>
+              </w:rPr>
+            </w:pPr>
+            <w:r>
+              <w:rPr>
+                <w:rFonts w:ascii="Calibri" w:hAnsi="Calibri"/>
+                <w:color w:val="000000"/>
+                <w:sz w:val="16"/>
+              </w:rPr>
+              <w:t>3 días</w:t>
+            </w:r>
+          </w:p>
+        </w:tc>
+        <w:tc>
+          <w:tcPr>
+            <w:tcW w:w="1150" w:type="dxa"/>
+          </w:tcPr>
+          <w:p>
+            <w:pPr>
+              <w:rPr>
+                <w:rFonts w:ascii="Calibri" w:hAnsi="Calibri" w:cs="Arial"/>
+                <w:i/>
+                <w:color w:val="548DD4"/>
+                <w:sz w:val="18"/>
+                <w:szCs w:val="20"/>
+                <w:lang w:eastAsia="es-CL"/>
+              </w:rPr>
+            </w:pPr>
+            <w:r>
+              <w:rPr>
+                <w:rFonts w:ascii="Calibri" w:hAnsi="Calibri"/>
+                <w:color w:val="000000"/>
+                <w:sz w:val="16"/>
+              </w:rPr>
+              <w:t>Equipo completo</w:t>
+            </w:r>
+          </w:p>
+        </w:tc>
+        <w:tc>
+          <w:tcPr>
+            <w:tcW w:w="1300" w:type="dxa"/>
+          </w:tcPr>
+          <w:p>
+            <w:pPr>
+              <w:rPr>
+                <w:rFonts w:ascii="Calibri" w:hAnsi="Calibri" w:cs="Arial"/>
+                <w:i/>
+                <w:color w:val="548DD4"/>
+                <w:sz w:val="18"/>
+                <w:szCs w:val="20"/>
+                <w:lang w:eastAsia="es-CL"/>
+              </w:rPr>
+            </w:pPr>
+          </w:p>
+        </w:tc>
+        <w:tc>
+          <w:tcPr>
+            <w:tcW w:w="1050" w:type="dxa"/>
+          </w:tcPr>
+          <w:p>
+            <w:pPr>
+              <w:rPr>
+                <w:rFonts w:ascii="Calibri" w:hAnsi="Calibri" w:cs="Arial"/>
+                <w:i/>
+                <w:color w:val="548DD4"/>
+                <w:sz w:val="18"/>
+                <w:szCs w:val="20"/>
+                <w:lang w:eastAsia="es-CL"/>
+              </w:rPr>
+            </w:pPr>
+            <w:r>
+              <w:rPr>
+                <w:rFonts w:ascii="Calibri" w:hAnsi="Calibri"/>
+                <w:color w:val="000000"/>
+                <w:sz w:val="16"/>
+              </w:rPr>
+              <w:t>No iniciado</w:t>
+            </w:r>
+          </w:p>
+        </w:tc>
+        <w:tc>
+          <w:tcPr>
+            <w:tcW w:w="2076" w:type="dxa"/>
+          </w:tcPr>
+          <w:p>
+            <w:pPr>
+              <w:rPr>
+                <w:rFonts w:ascii="Calibri" w:hAnsi="Calibri" w:cs="Arial"/>
+                <w:i/>
+                <w:color w:val="548DD4"/>
+                <w:sz w:val="18"/>
+                <w:szCs w:val="20"/>
+                <w:lang w:eastAsia="es-CL"/>
+              </w:rPr>
+            </w:pPr>
+            <w:r>
+              <w:rPr>
+                <w:rFonts w:ascii="Calibri" w:hAnsi="Calibri"/>
+                <w:color w:val="000000"/>
+                <w:sz w:val="16"/>
+              </w:rPr>
+              <w:t>Se usará el sistema real en lugar del prototipo en Figma.</w:t>
+            </w:r>
+          </w:p>
+        </w:tc>
+      </w:tr>
+      <w:tr>
+        <w:tc>
+          <w:tcPr>
+            <w:tcW w:w="1050" w:type="dxa"/>
+          </w:tcPr>
+          <w:p>
+            <w:pPr>
+              <w:rPr>
+                <w:b/>
+                <w:sz w:val="18"/>
+                <w:szCs w:val="24"/>
+              </w:rPr>
+            </w:pPr>
+            <w:r>
+              <w:rPr>
+                <w:rFonts w:ascii="Calibri" w:hAnsi="Calibri"/>
+                <w:color w:val="000000"/>
+                <w:sz w:val="16"/>
+              </w:rPr>
+              <w:t>Gestión de proyectos informáticos</w:t>
+            </w:r>
+          </w:p>
+        </w:tc>
+        <w:tc>
+          <w:tcPr>
+            <w:tcW w:w="1150" w:type="dxa"/>
+          </w:tcPr>
+          <w:p>
+            <w:pPr>
+              <w:rPr>
+                <w:rFonts w:ascii="Calibri" w:hAnsi="Calibri" w:cs="Arial"/>
+                <w:i/>
+                <w:color w:val="548DD4"/>
+                <w:sz w:val="18"/>
+                <w:szCs w:val="20"/>
+                <w:lang w:eastAsia="es-CL"/>
+              </w:rPr>
+            </w:pPr>
+            <w:r>
+              <w:rPr>
+                <w:rFonts w:ascii="Calibri" w:hAnsi="Calibri"/>
+                <w:color w:val="000000"/>
+                <w:sz w:val="16"/>
+              </w:rPr>
+              <w:t>Retrospectiva del proyecto</w:t>
+            </w:r>
+          </w:p>
+        </w:tc>
+        <w:tc>
+          <w:tcPr>
+            <w:tcW w:w="1100" w:type="dxa"/>
+          </w:tcPr>
+          <w:p>
+            <w:pPr>
+              <w:rPr>
+                <w:b/>
+                <w:sz w:val="18"/>
+                <w:szCs w:val="24"/>
+              </w:rPr>
+            </w:pPr>
+            <w:r>
+              <w:rPr>
+                <w:rFonts w:ascii="Calibri" w:hAnsi="Calibri"/>
+                <w:color w:val="000000"/>
+                <w:sz w:val="16"/>
+              </w:rPr>
+              <w:t>Reunión con el equipo</w:t>
+            </w:r>
+          </w:p>
+        </w:tc>
+        <w:tc>
+          <w:tcPr>
+            <w:tcW w:w="900" w:type="dxa"/>
+          </w:tcPr>
+          <w:p>
+            <w:pPr>
+              <w:rPr>
+                <w:b/>
+                <w:sz w:val="18"/>
+                <w:szCs w:val="24"/>
+              </w:rPr>
+            </w:pPr>
+            <w:r>
+              <w:rPr>
+                <w:rFonts w:ascii="Calibri" w:hAnsi="Calibri"/>
+                <w:color w:val="000000"/>
+                <w:sz w:val="16"/>
+              </w:rPr>
+              <w:t>1 día</w:t>
+            </w:r>
+          </w:p>
+        </w:tc>
+        <w:tc>
+          <w:tcPr>
+            <w:tcW w:w="1150" w:type="dxa"/>
+          </w:tcPr>
+          <w:p>
+            <w:pPr>
+              <w:rPr>
+                <w:rFonts w:ascii="Calibri" w:hAnsi="Calibri" w:cs="Arial"/>
+                <w:i/>
+                <w:color w:val="548DD4"/>
+                <w:sz w:val="18"/>
+                <w:szCs w:val="20"/>
+                <w:lang w:eastAsia="es-CL"/>
+              </w:rPr>
+            </w:pPr>
+            <w:r>
+              <w:rPr>
+                <w:rFonts w:ascii="Calibri" w:hAnsi="Calibri"/>
+                <w:color w:val="000000"/>
+                <w:sz w:val="16"/>
+              </w:rPr>
+              <w:t>Equipo completo</w:t>
+            </w:r>
+          </w:p>
+        </w:tc>
+        <w:tc>
+          <w:tcPr>
+            <w:tcW w:w="1300" w:type="dxa"/>
+          </w:tcPr>
+          <w:p>
+            <w:pPr>
+              <w:rPr>
+                <w:rFonts w:ascii="Calibri" w:hAnsi="Calibri" w:cs="Arial"/>
+                <w:i/>
+                <w:color w:val="548DD4"/>
+                <w:sz w:val="18"/>
+                <w:szCs w:val="20"/>
+                <w:lang w:eastAsia="es-CL"/>
+              </w:rPr>
+            </w:pPr>
+          </w:p>
+        </w:tc>
+        <w:tc>
+          <w:tcPr>
+            <w:tcW w:w="1050" w:type="dxa"/>
+          </w:tcPr>
+          <w:p>
+            <w:pPr>
+              <w:rPr>
+                <w:rFonts w:ascii="Calibri" w:hAnsi="Calibri" w:cs="Arial"/>
+                <w:i/>
+                <w:color w:val="548DD4"/>
+                <w:sz w:val="18"/>
+                <w:szCs w:val="20"/>
+                <w:lang w:eastAsia="es-CL"/>
+              </w:rPr>
+            </w:pPr>
+            <w:r>
+              <w:rPr>
+                <w:rFonts w:ascii="Calibri" w:hAnsi="Calibri"/>
+                <w:color w:val="000000"/>
+                <w:sz w:val="16"/>
+              </w:rPr>
+              <w:t>No iniciado</w:t>
+            </w:r>
+          </w:p>
+        </w:tc>
+        <w:tc>
+          <w:tcPr>
+            <w:tcW w:w="2076" w:type="dxa"/>
+          </w:tcPr>
+          <w:p>
+            <w:pPr>
+              <w:rPr>
+                <w:rFonts w:ascii="Calibri" w:hAnsi="Calibri" w:cs="Arial"/>
+                <w:i/>
+                <w:color w:val="548DD4"/>
+                <w:sz w:val="18"/>
+                <w:szCs w:val="20"/>
+                <w:lang w:eastAsia="es-CL"/>
+              </w:rPr>
+            </w:pPr>
+            <w:r>
+              <w:rPr>
+                <w:rFonts w:ascii="Calibri" w:hAnsi="Calibri"/>
+                <w:color w:val="000000"/>
+                <w:sz w:val="16"/>
+              </w:rPr>
+              <w:t>Sin ajustes.</w:t>
             </w:r>
           </w:p>
         </w:tc>
@@ -2652,58 +5266,25 @@
           </w:p>
           <w:p>
             <w:pPr>
-              <w:rPr>
-                <w:rFonts w:ascii="Calibri" w:hAnsi="Calibri"/>
-                <w:color w:val="1F3864" w:themeColor="accent1" w:themeShade="80"/>
-              </w:rPr>
-            </w:pPr>
-          </w:p>
-          <w:p>
-            <w:pPr>
-              <w:rPr>
-                <w:rFonts w:ascii="Calibri" w:hAnsi="Calibri"/>
-                <w:color w:val="1F3864" w:themeColor="accent1" w:themeShade="80"/>
-              </w:rPr>
-            </w:pPr>
-          </w:p>
-          <w:p>
-            <w:pPr>
+              <w:spacing w:after="60"/>
+              <w:ind w:left="340" w:hanging="227"/>
               <w:jc w:val="both"/>
               <w:rPr>
-                <w:rFonts w:ascii="Calibri" w:hAnsi="Calibri" w:cs="Arial"/>
-                <w:i/>
-                <w:color w:val="548DD4"/>
-                <w:sz w:val="20"/>
-                <w:szCs w:val="20"/>
-                <w:lang w:eastAsia="es-CL"/>
-              </w:rPr>
-            </w:pPr>
-          </w:p>
-          <w:p>
-            <w:pPr>
+                <w:rFonts w:ascii="Calibri" w:hAnsi="Calibri"/>
+                <w:color w:val="000000"/>
+                <w:sz w:val="20"/>
+              </w:rPr>
+            </w:pPr>
+          </w:p>
+          <w:p>
+            <w:pPr>
+              <w:spacing w:after="60"/>
+              <w:ind w:left="340" w:hanging="227"/>
               <w:jc w:val="both"/>
-              <w:rPr>
-                <w:rFonts w:ascii="Calibri" w:hAnsi="Calibri" w:cs="Arial"/>
-                <w:i/>
-                <w:color w:val="548DD4"/>
-                <w:sz w:val="20"/>
-                <w:szCs w:val="20"/>
-                <w:lang w:eastAsia="es-CL"/>
-              </w:rPr>
-            </w:pPr>
-          </w:p>
-          <w:p>
-            <w:pPr>
-              <w:jc w:val="both"/>
-              <w:rPr>
-                <w:rFonts w:ascii="Calibri" w:hAnsi="Calibri" w:cs="Arial"/>
-                <w:i/>
-                <w:color w:val="548DD4"/>
-                <w:sz w:val="20"/>
-                <w:szCs w:val="20"/>
-                <w:lang w:eastAsia="es-CL"/>
-              </w:rPr>
-            </w:pPr>
+            </w:pPr>
+            <w:r>
+              <w:t>El contexto del proyecto se puede decir que nos ha facilitado parte del desarrollo del proyecto, debido a que terminar una tarea nos daba paso a terminar o avanzar a gran escala con la siguiente.</w:t>
+            </w:r>
           </w:p>
         </w:tc>
       </w:tr>
@@ -2763,7 +5344,6 @@
                 <w:rFonts w:ascii="Calibri" w:hAnsi="Calibri"/>
                 <w:color w:val="1F3864" w:themeColor="accent1" w:themeShade="80"/>
               </w:rPr>
-              <w:lastRenderedPageBreak/>
               <w:t xml:space="preserve">Actividades ajustadas o eliminadas: </w:t>
             </w:r>
             <w:r>
@@ -2882,101 +5462,26 @@
           </w:p>
           <w:p>
             <w:pPr>
+              <w:spacing w:after="60"/>
+              <w:ind w:left="340" w:hanging="227"/>
               <w:jc w:val="both"/>
-              <w:rPr>
-                <w:rFonts w:ascii="Calibri" w:hAnsi="Calibri" w:cs="Arial"/>
-                <w:i/>
-                <w:color w:val="548DD4"/>
-                <w:sz w:val="20"/>
-                <w:szCs w:val="20"/>
-                <w:lang w:eastAsia="es-CL"/>
-              </w:rPr>
-            </w:pPr>
-          </w:p>
-          <w:p>
-            <w:pPr>
+            </w:pPr>
+          </w:p>
+          <w:p>
+            <w:pPr>
+              <w:spacing w:after="60"/>
+              <w:ind w:left="340" w:hanging="227"/>
               <w:jc w:val="both"/>
-              <w:rPr>
-                <w:rFonts w:ascii="Calibri" w:hAnsi="Calibri" w:cs="Arial"/>
-                <w:i/>
-                <w:color w:val="C00000"/>
-                <w:sz w:val="20"/>
-                <w:szCs w:val="20"/>
-                <w:lang w:eastAsia="es-CL"/>
-              </w:rPr>
-            </w:pPr>
-          </w:p>
-          <w:p>
-            <w:pPr>
-              <w:jc w:val="both"/>
-              <w:rPr>
-                <w:rFonts w:ascii="Calibri" w:hAnsi="Calibri" w:cs="Arial"/>
-                <w:i/>
-                <w:color w:val="548DD4"/>
-                <w:sz w:val="20"/>
-                <w:szCs w:val="20"/>
-                <w:lang w:eastAsia="es-CL"/>
-              </w:rPr>
-            </w:pPr>
-          </w:p>
-          <w:p>
-            <w:pPr>
-              <w:jc w:val="both"/>
-              <w:rPr>
-                <w:rFonts w:ascii="Calibri" w:hAnsi="Calibri" w:cs="Arial"/>
-                <w:i/>
-                <w:color w:val="548DD4"/>
-                <w:sz w:val="20"/>
-                <w:szCs w:val="20"/>
-                <w:lang w:eastAsia="es-CL"/>
-              </w:rPr>
-            </w:pPr>
-          </w:p>
-          <w:p>
-            <w:pPr>
-              <w:jc w:val="both"/>
-              <w:rPr>
-                <w:rFonts w:ascii="Calibri" w:hAnsi="Calibri" w:cs="Arial"/>
-                <w:i/>
-                <w:color w:val="548DD4"/>
-                <w:sz w:val="20"/>
-                <w:szCs w:val="20"/>
-                <w:lang w:eastAsia="es-CL"/>
-              </w:rPr>
-            </w:pPr>
-          </w:p>
-          <w:p>
-            <w:pPr>
-              <w:jc w:val="both"/>
-              <w:rPr>
-                <w:rFonts w:ascii="Calibri" w:hAnsi="Calibri" w:cs="Arial"/>
-                <w:i/>
-                <w:color w:val="548DD4"/>
-                <w:sz w:val="20"/>
-                <w:szCs w:val="20"/>
-                <w:lang w:eastAsia="es-CL"/>
-              </w:rPr>
-            </w:pPr>
-          </w:p>
-          <w:p>
-            <w:pPr>
-              <w:jc w:val="both"/>
-              <w:rPr>
-                <w:rFonts w:ascii="Calibri" w:hAnsi="Calibri" w:cs="Arial"/>
-                <w:i/>
-                <w:color w:val="548DD4"/>
-                <w:sz w:val="20"/>
-                <w:szCs w:val="20"/>
-                <w:lang w:eastAsia="es-CL"/>
-              </w:rPr>
-            </w:pPr>
+            </w:pPr>
+            <w:r>
+              <w:t>Lo que se podría considerar un ajuste, fue pasar de utilizar PostgreSQL como tal a utilizar a la herramienta de Supabase que nos da buenas ventajas, pero que también está ambientada a PostgreSQL. Por otro lado tocara ajustar o añadir nuevas tareas al tablero debido a nuevos hallazgos que son importantes implementar en el proyecto.</w:t>
+            </w:r>
           </w:p>
         </w:tc>
       </w:tr>
     </w:tbl>
     <w:p>
       <w:pPr>
-        <w:spacing w:after="0" w:line="240" w:lineRule="auto"/>
         <w:jc w:val="both"/>
         <w:rPr>
           <w:rFonts w:ascii="Calibri" w:hAnsi="Calibri" w:cs="Arial"/>
@@ -2990,7 +5495,6 @@
     </w:p>
     <w:p>
       <w:pPr>
-        <w:spacing w:after="0" w:line="240" w:lineRule="auto"/>
         <w:jc w:val="both"/>
         <w:rPr>
           <w:rFonts w:ascii="Calibri" w:hAnsi="Calibri" w:cs="Arial"/>
@@ -3161,31 +5665,7 @@
                 <w:szCs w:val="20"/>
                 <w:lang w:eastAsia="es-CL"/>
               </w:rPr>
-              <w:t xml:space="preserve"> </w:t>
-            </w:r>
-            <w:proofErr w:type="gramStart"/>
-            <w:r>
-              <w:rPr>
-                <w:rFonts w:ascii="Calibri" w:hAnsi="Calibri" w:cs="Arial"/>
-                <w:i/>
-                <w:color w:val="548DD4"/>
-                <w:sz w:val="20"/>
-                <w:szCs w:val="20"/>
-                <w:lang w:eastAsia="es-CL"/>
-              </w:rPr>
-              <w:t>de acuerdo a</w:t>
-            </w:r>
-            <w:proofErr w:type="gramEnd"/>
-            <w:r>
-              <w:rPr>
-                <w:rFonts w:ascii="Calibri" w:hAnsi="Calibri" w:cs="Arial"/>
-                <w:i/>
-                <w:color w:val="548DD4"/>
-                <w:sz w:val="20"/>
-                <w:szCs w:val="20"/>
-                <w:lang w:eastAsia="es-CL"/>
-              </w:rPr>
-              <w:t xml:space="preserve"> tu planificación</w:t>
+              <w:t xml:space="preserve"> de acuerdo a tu planificación</w:t>
             </w:r>
             <w:r>
               <w:rPr>
@@ -3234,94 +5714,20 @@
           </w:p>
           <w:p>
             <w:pPr>
+              <w:spacing w:after="60"/>
+              <w:ind w:left="340" w:hanging="227"/>
               <w:jc w:val="both"/>
-              <w:rPr>
-                <w:rFonts w:ascii="Calibri" w:hAnsi="Calibri" w:cs="Arial"/>
-                <w:i/>
-                <w:color w:val="548DD4"/>
-                <w:sz w:val="20"/>
-                <w:szCs w:val="20"/>
-                <w:lang w:eastAsia="es-CL"/>
-              </w:rPr>
-            </w:pPr>
-          </w:p>
-          <w:p>
-            <w:pPr>
+            </w:pPr>
+          </w:p>
+          <w:p>
+            <w:pPr>
+              <w:spacing w:after="60"/>
+              <w:ind w:left="340" w:hanging="227"/>
               <w:jc w:val="both"/>
-              <w:rPr>
-                <w:rFonts w:ascii="Calibri" w:hAnsi="Calibri" w:cs="Arial"/>
-                <w:i/>
-                <w:color w:val="548DD4"/>
-                <w:sz w:val="20"/>
-                <w:szCs w:val="20"/>
-                <w:lang w:eastAsia="es-CL"/>
-              </w:rPr>
-            </w:pPr>
-          </w:p>
-          <w:p>
-            <w:pPr>
-              <w:jc w:val="both"/>
-              <w:rPr>
-                <w:rFonts w:ascii="Calibri" w:hAnsi="Calibri" w:cs="Arial"/>
-                <w:i/>
-                <w:color w:val="548DD4"/>
-                <w:sz w:val="20"/>
-                <w:szCs w:val="20"/>
-                <w:lang w:eastAsia="es-CL"/>
-              </w:rPr>
-            </w:pPr>
-          </w:p>
-          <w:p>
-            <w:pPr>
-              <w:jc w:val="both"/>
-              <w:rPr>
-                <w:rFonts w:ascii="Calibri" w:hAnsi="Calibri" w:cs="Arial"/>
-                <w:i/>
-                <w:color w:val="548DD4"/>
-                <w:sz w:val="20"/>
-                <w:szCs w:val="20"/>
-                <w:lang w:eastAsia="es-CL"/>
-              </w:rPr>
-            </w:pPr>
-          </w:p>
-          <w:p>
-            <w:pPr>
-              <w:jc w:val="both"/>
-              <w:rPr>
-                <w:rFonts w:ascii="Calibri" w:hAnsi="Calibri" w:cs="Arial"/>
-                <w:i/>
-                <w:color w:val="548DD4"/>
-                <w:sz w:val="20"/>
-                <w:szCs w:val="20"/>
-                <w:lang w:eastAsia="es-CL"/>
-              </w:rPr>
-            </w:pPr>
-          </w:p>
-          <w:p>
-            <w:pPr>
-              <w:jc w:val="both"/>
-              <w:rPr>
-                <w:rFonts w:ascii="Calibri" w:hAnsi="Calibri" w:cs="Arial"/>
-                <w:i/>
-                <w:color w:val="548DD4"/>
-                <w:sz w:val="20"/>
-                <w:szCs w:val="20"/>
-                <w:lang w:eastAsia="es-CL"/>
-              </w:rPr>
-            </w:pPr>
-          </w:p>
-          <w:p>
-            <w:pPr>
-              <w:jc w:val="both"/>
-              <w:rPr>
-                <w:rFonts w:ascii="Calibri" w:hAnsi="Calibri" w:cs="Arial"/>
-                <w:i/>
-                <w:color w:val="548DD4"/>
-                <w:sz w:val="20"/>
-                <w:szCs w:val="20"/>
-                <w:lang w:eastAsia="es-CL"/>
-              </w:rPr>
-            </w:pPr>
+            </w:pPr>
+            <w:r>
+              <w:t>Hasta el momento lo que se puede decir que tenemos atrasado es el desarrollo del plan de pruebas que nos atrasa con el cumplimiento de tareas del tablero.</w:t>
+            </w:r>
           </w:p>
         </w:tc>
       </w:tr>
@@ -3334,7 +5740,7 @@
       </w:pPr>
     </w:p>
     <w:sectPr>
-      <w:headerReference w:type="default" r:id="rId10"/>
+      <w:headerReference w:type="default" r:id="rId13"/>
       <w:pgSz w:w="11906" w:h="16838"/>
       <w:pgMar w:top="1417" w:right="1701" w:bottom="1417" w:left="1701" w:header="708" w:footer="708" w:gutter="0"/>
       <w:cols w:space="708"/>
@@ -3348,9 +5754,6 @@
 <w:endnotes xmlns:wpc="http://schemas.microsoft.com/office/word/2010/wordprocessingCanvas" xmlns:cx="http://schemas.microsoft.com/office/drawing/2014/chartex" xmlns:cx1="http://schemas.microsoft.com/office/drawing/2015/9/8/chartex" xmlns:cx2="http://schemas.microsoft.com/office/drawing/2015/10/21/chartex" xmlns:cx3="http://schemas.microsoft.com/office/drawing/2016/5/9/chartex" xmlns:cx4="http://schemas.microsoft.com/office/drawing/2016/5/10/chartex" xmlns:cx5="http://schemas.microsoft.com/office/drawing/2016/5/11/chartex" xmlns:cx6="http://schemas.microsoft.com/office/drawing/2016/5/12/chartex" xmlns:cx7="http://schemas.microsoft.com/office/drawing/2016/5/13/chartex" xmlns:cx8="http://schemas.microsoft.com/office/drawing/2016/5/14/chartex" xmlns:mc="http://schemas.openxmlformats.org/markup-compatibility/2006" xmlns:aink="http://schemas.microsoft.com/office/drawing/2016/ink" xmlns:am3d="http://schemas.microsoft.com/office/drawing/2017/model3d" xmlns:o="urn:schemas-microsoft-com:office:office" xmlns:oel="http://schemas.microsoft.com/office/2019/extlst" xmlns:r="http://schemas.openxmlformats.org/officeDocument/2006/relationships" xmlns:m="http://schemas.openxmlformats.org/officeDocument/2006/math" xmlns:v="urn:schemas-microsoft-com:vml" xmlns:wp14="http://schemas.microsoft.com/office/word/2010/wordprocessingDrawing" xmlns:wp="http://schemas.openxmlformats.org/drawingml/2006/wordprocessingDrawing" xmlns:w10="urn:schemas-microsoft-com:office:word" xmlns:w="http://schemas.openxmlformats.org/wordprocessingml/2006/main" xmlns:w14="http://schemas.microsoft.com/office/word/2010/wordml" xmlns:w15="http://schemas.microsoft.com/office/word/2012/wordml" xmlns:w16cex="http://schemas.microsoft.com/office/word/2018/wordml/cex" xmlns:w16cid="http://schemas.microsoft.com/office/word/2016/wordml/cid" xmlns:w16="http://schemas.microsoft.com/office/word/2018/wordml" xmlns:w16sdtdh="http://schemas.microsoft.com/office/word/2020/wordml/sdtdatahash" xmlns:w16se="http://schemas.microsoft.com/office/word/2015/wordml/symex" xmlns:wpg="http://schemas.microsoft.com/office/word/2010/wordprocessingGroup" xmlns:wpi="http://schemas.microsoft.com/office/word/2010/wordprocessingInk" xmlns:wne="http://schemas.microsoft.com/office/word/2006/wordml" xmlns:wps="http://schemas.microsoft.com/office/word/2010/wordprocessingShape" mc:Ignorable="w14 w15 w16se w16cid w16 w16cex w16sdtdh wp14">
   <w:endnote w:type="separator" w:id="-1">
     <w:p>
-      <w:pPr>
-        <w:spacing w:after="0" w:line="240" w:lineRule="auto"/>
-      </w:pPr>
       <w:r>
         <w:separator/>
       </w:r>
@@ -3358,9 +5761,6 @@
   </w:endnote>
   <w:endnote w:type="continuationSeparator" w:id="0">
     <w:p>
-      <w:pPr>
-        <w:spacing w:after="0" w:line="240" w:lineRule="auto"/>
-      </w:pPr>
       <w:r>
         <w:continuationSeparator/>
       </w:r>
@@ -3373,9 +5773,6 @@
 <w:footnotes xmlns:wpc="http://schemas.microsoft.com/office/word/2010/wordprocessingCanvas" xmlns:cx="http://schemas.microsoft.com/office/drawing/2014/chartex" xmlns:cx1="http://schemas.microsoft.com/office/drawing/2015/9/8/chartex" xmlns:cx2="http://schemas.microsoft.com/office/drawing/2015/10/21/chartex" xmlns:cx3="http://schemas.microsoft.com/office/drawing/2016/5/9/chartex" xmlns:cx4="http://schemas.microsoft.com/office/drawing/2016/5/10/chartex" xmlns:cx5="http://schemas.microsoft.com/office/drawing/2016/5/11/chartex" xmlns:cx6="http://schemas.microsoft.com/office/drawing/2016/5/12/chartex" xmlns:cx7="http://schemas.microsoft.com/office/drawing/2016/5/13/chartex" xmlns:cx8="http://schemas.microsoft.com/office/drawing/2016/5/14/chartex" xmlns:mc="http://schemas.openxmlformats.org/markup-compatibility/2006" xmlns:aink="http://schemas.microsoft.com/office/drawing/2016/ink" xmlns:am3d="http://schemas.microsoft.com/office/drawing/2017/model3d" xmlns:o="urn:schemas-microsoft-com:office:office" xmlns:oel="http://schemas.microsoft.com/office/2019/extlst" xmlns:r="http://schemas.openxmlformats.org/officeDocument/2006/relationships" xmlns:m="http://schemas.openxmlformats.org/officeDocument/2006/math" xmlns:v="urn:schemas-microsoft-com:vml" xmlns:wp14="http://schemas.microsoft.com/office/word/2010/wordprocessingDrawing" xmlns:wp="http://schemas.openxmlformats.org/drawingml/2006/wordprocessingDrawing" xmlns:w10="urn:schemas-microsoft-com:office:word" xmlns:w="http://schemas.openxmlformats.org/wordprocessingml/2006/main" xmlns:w14="http://schemas.microsoft.com/office/word/2010/wordml" xmlns:w15="http://schemas.microsoft.com/office/word/2012/wordml" xmlns:w16cex="http://schemas.microsoft.com/office/word/2018/wordml/cex" xmlns:w16cid="http://schemas.microsoft.com/office/word/2016/wordml/cid" xmlns:w16="http://schemas.microsoft.com/office/word/2018/wordml" xmlns:w16sdtdh="http://schemas.microsoft.com/office/word/2020/wordml/sdtdatahash" xmlns:w16se="http://schemas.microsoft.com/office/word/2015/wordml/symex" xmlns:wpg="http://schemas.microsoft.com/office/word/2010/wordprocessingGroup" xmlns:wpi="http://schemas.microsoft.com/office/word/2010/wordprocessingInk" xmlns:wne="http://schemas.microsoft.com/office/word/2006/wordml" xmlns:wps="http://schemas.microsoft.com/office/word/2010/wordprocessingShape" mc:Ignorable="w14 w15 w16se w16cid w16 w16cex w16sdtdh wp14">
   <w:footnote w:type="separator" w:id="-1">
     <w:p>
-      <w:pPr>
-        <w:spacing w:after="0" w:line="240" w:lineRule="auto"/>
-      </w:pPr>
       <w:r>
         <w:separator/>
       </w:r>
@@ -3383,9 +5780,6 @@
   </w:footnote>
   <w:footnote w:type="continuationSeparator" w:id="0">
     <w:p>
-      <w:pPr>
-        <w:spacing w:after="0" w:line="240" w:lineRule="auto"/>
-      </w:pPr>
       <w:r>
         <w:continuationSeparator/>
       </w:r>
@@ -3481,7 +5875,6 @@
         </w:tcPr>
         <w:p>
           <w:pPr>
-            <w:spacing w:after="0"/>
             <w:rPr>
               <w:rFonts w:ascii="Century Gothic" w:eastAsia="Century Gothic" w:hAnsi="Century Gothic" w:cs="Century Gothic"/>
               <w:b/>
@@ -3563,7 +5956,6 @@
         </w:p>
         <w:p>
           <w:pPr>
-            <w:spacing w:after="0"/>
             <w:rPr>
               <w:rFonts w:ascii="Century Gothic" w:eastAsia="Century Gothic" w:hAnsi="Century Gothic" w:cs="Century Gothic"/>
               <w:b/>
@@ -3621,7 +6013,7 @@
               <w:lang w:eastAsia="es-CL"/>
             </w:rPr>
             <w:drawing>
-              <wp:inline distT="0" distB="0" distL="0" distR="0" wp14:anchorId="796B0F40" wp14:editId="1B350AE8">
+              <wp:inline distT="0" distB="0" distL="0" distR="0" wp14:anchorId="6AB31C0D" wp14:editId="7447FD0E">
                 <wp:extent cx="1996440" cy="428625"/>
                 <wp:effectExtent l="0" t="0" r="3810" b="9525"/>
                 <wp:docPr id="3" name="Imagen 3" descr="http://www.duoc.cl/normasgraficas/normasgraficas/marca-duoc/6logo-fondo-transparente/fondo-transparente.png"/>
@@ -3800,8 +6192,124 @@
       </w:rPr>
     </w:lvl>
   </w:abstractNum>
+  <w:abstractNum w:abstractNumId="1" w15:restartNumberingAfterBreak="0">
+    <w:nsid w:val="683330F4"/>
+    <w:multiLevelType w:val="hybridMultilevel"/>
+    <w:tmpl w:val="7AC8E7E8"/>
+    <w:lvl w:ilvl="0" w:tplc="340A0001">
+      <w:start w:val="1"/>
+      <w:numFmt w:val="bullet"/>
+      <w:lvlText w:val=""/>
+      <w:lvlJc w:val="left"/>
+      <w:pPr>
+        <w:ind w:left="720" w:hanging="360"/>
+      </w:pPr>
+      <w:rPr>
+        <w:rFonts w:ascii="Symbol" w:hAnsi="Symbol" w:hint="default"/>
+      </w:rPr>
+    </w:lvl>
+    <w:lvl w:ilvl="1" w:tplc="340A0003" w:tentative="1">
+      <w:start w:val="1"/>
+      <w:numFmt w:val="bullet"/>
+      <w:lvlText w:val="o"/>
+      <w:lvlJc w:val="left"/>
+      <w:pPr>
+        <w:ind w:left="1440" w:hanging="360"/>
+      </w:pPr>
+      <w:rPr>
+        <w:rFonts w:ascii="Courier New" w:hAnsi="Courier New" w:cs="Courier New" w:hint="default"/>
+      </w:rPr>
+    </w:lvl>
+    <w:lvl w:ilvl="2" w:tplc="340A0005" w:tentative="1">
+      <w:start w:val="1"/>
+      <w:numFmt w:val="bullet"/>
+      <w:lvlText w:val=""/>
+      <w:lvlJc w:val="left"/>
+      <w:pPr>
+        <w:ind w:left="2160" w:hanging="360"/>
+      </w:pPr>
+      <w:rPr>
+        <w:rFonts w:ascii="Wingdings" w:hAnsi="Wingdings" w:hint="default"/>
+      </w:rPr>
+    </w:lvl>
+    <w:lvl w:ilvl="3" w:tplc="340A0001" w:tentative="1">
+      <w:start w:val="1"/>
+      <w:numFmt w:val="bullet"/>
+      <w:lvlText w:val=""/>
+      <w:lvlJc w:val="left"/>
+      <w:pPr>
+        <w:ind w:left="2880" w:hanging="360"/>
+      </w:pPr>
+      <w:rPr>
+        <w:rFonts w:ascii="Symbol" w:hAnsi="Symbol" w:hint="default"/>
+      </w:rPr>
+    </w:lvl>
+    <w:lvl w:ilvl="4" w:tplc="340A0003" w:tentative="1">
+      <w:start w:val="1"/>
+      <w:numFmt w:val="bullet"/>
+      <w:lvlText w:val="o"/>
+      <w:lvlJc w:val="left"/>
+      <w:pPr>
+        <w:ind w:left="3600" w:hanging="360"/>
+      </w:pPr>
+      <w:rPr>
+        <w:rFonts w:ascii="Courier New" w:hAnsi="Courier New" w:cs="Courier New" w:hint="default"/>
+      </w:rPr>
+    </w:lvl>
+    <w:lvl w:ilvl="5" w:tplc="340A0005" w:tentative="1">
+      <w:start w:val="1"/>
+      <w:numFmt w:val="bullet"/>
+      <w:lvlText w:val=""/>
+      <w:lvlJc w:val="left"/>
+      <w:pPr>
+        <w:ind w:left="4320" w:hanging="360"/>
+      </w:pPr>
+      <w:rPr>
+        <w:rFonts w:ascii="Wingdings" w:hAnsi="Wingdings" w:hint="default"/>
+      </w:rPr>
+    </w:lvl>
+    <w:lvl w:ilvl="6" w:tplc="340A0001" w:tentative="1">
+      <w:start w:val="1"/>
+      <w:numFmt w:val="bullet"/>
+      <w:lvlText w:val=""/>
+      <w:lvlJc w:val="left"/>
+      <w:pPr>
+        <w:ind w:left="5040" w:hanging="360"/>
+      </w:pPr>
+      <w:rPr>
+        <w:rFonts w:ascii="Symbol" w:hAnsi="Symbol" w:hint="default"/>
+      </w:rPr>
+    </w:lvl>
+    <w:lvl w:ilvl="7" w:tplc="340A0003" w:tentative="1">
+      <w:start w:val="1"/>
+      <w:numFmt w:val="bullet"/>
+      <w:lvlText w:val="o"/>
+      <w:lvlJc w:val="left"/>
+      <w:pPr>
+        <w:ind w:left="5760" w:hanging="360"/>
+      </w:pPr>
+      <w:rPr>
+        <w:rFonts w:ascii="Courier New" w:hAnsi="Courier New" w:cs="Courier New" w:hint="default"/>
+      </w:rPr>
+    </w:lvl>
+    <w:lvl w:ilvl="8" w:tplc="340A0005" w:tentative="1">
+      <w:start w:val="1"/>
+      <w:numFmt w:val="bullet"/>
+      <w:lvlText w:val=""/>
+      <w:lvlJc w:val="left"/>
+      <w:pPr>
+        <w:ind w:left="6480" w:hanging="360"/>
+      </w:pPr>
+      <w:rPr>
+        <w:rFonts w:ascii="Wingdings" w:hAnsi="Wingdings" w:hint="default"/>
+      </w:rPr>
+    </w:lvl>
+  </w:abstractNum>
   <w:num w:numId="1" w16cid:durableId="361051546">
     <w:abstractNumId w:val="0"/>
+  </w:num>
+  <w:num w:numId="2" w16cid:durableId="548953503">
+    <w:abstractNumId w:val="1"/>
   </w:num>
 </w:numbering>
 </file>
@@ -4201,9 +6709,6 @@
     <w:name w:val="Normal"/>
     <w:qFormat/>
     <w:rsid w:val="0003309E"/>
-    <w:pPr>
-      <w:spacing w:after="160" w:line="259" w:lineRule="auto"/>
-    </w:pPr>
     <w:rPr>
       <w:sz w:val="22"/>
       <w:szCs w:val="22"/>
@@ -4221,7 +6726,7 @@
     <w:pPr>
       <w:keepNext/>
       <w:keepLines/>
-      <w:spacing w:before="40" w:after="0"/>
+      <w:spacing w:before="40"/>
       <w:outlineLvl w:val="2"/>
     </w:pPr>
     <w:rPr>
@@ -4301,7 +6806,6 @@
         <w:tab w:val="center" w:pos="4419"/>
         <w:tab w:val="right" w:pos="8838"/>
       </w:tabs>
-      <w:spacing w:after="0" w:line="240" w:lineRule="auto"/>
     </w:pPr>
   </w:style>
   <w:style w:type="character" w:customStyle="1" w:styleId="PiedepginaCar">
@@ -4323,9 +6827,6 @@
     <w:semiHidden/>
     <w:unhideWhenUsed/>
     <w:rsid w:val="0003309E"/>
-    <w:pPr>
-      <w:spacing w:after="0" w:line="240" w:lineRule="auto"/>
-    </w:pPr>
     <w:rPr>
       <w:sz w:val="20"/>
       <w:szCs w:val="20"/>
@@ -4366,7 +6867,6 @@
         <w:tab w:val="center" w:pos="4419"/>
         <w:tab w:val="right" w:pos="8838"/>
       </w:tabs>
-      <w:spacing w:after="0" w:line="240" w:lineRule="auto"/>
     </w:pPr>
   </w:style>
   <w:style w:type="character" w:customStyle="1" w:styleId="EncabezadoCar">
@@ -4409,9 +6909,6 @@
     <w:semiHidden/>
     <w:unhideWhenUsed/>
     <w:rsid w:val="00C5122E"/>
-    <w:pPr>
-      <w:spacing w:after="0" w:line="240" w:lineRule="auto"/>
-    </w:pPr>
     <w:rPr>
       <w:rFonts w:ascii="Segoe UI" w:hAnsi="Segoe UI" w:cs="Segoe UI"/>
       <w:sz w:val="18"/>
@@ -4451,9 +6948,6 @@
     <w:semiHidden/>
     <w:unhideWhenUsed/>
     <w:rsid w:val="009E52DF"/>
-    <w:pPr>
-      <w:spacing w:line="240" w:lineRule="auto"/>
-    </w:pPr>
     <w:rPr>
       <w:sz w:val="20"/>
       <w:szCs w:val="20"/>
@@ -4498,6 +6992,17 @@
       <w:sz w:val="20"/>
       <w:szCs w:val="20"/>
     </w:rPr>
+  </w:style>
+  <w:style w:type="paragraph" w:styleId="Prrafodelista">
+    <w:name w:val="List Paragraph"/>
+    <w:basedOn w:val="Normal"/>
+    <w:uiPriority w:val="34"/>
+    <w:qFormat/>
+    <w:rsid w:val="005313F6"/>
+    <w:pPr>
+      <w:ind w:left="720"/>
+      <w:contextualSpacing/>
+    </w:pPr>
   </w:style>
 </w:styles>
 </file>
@@ -4798,15 +7303,6 @@
 </file>
 
 <file path=customXml/item1.xml><?xml version="1.0" encoding="utf-8"?>
-<?mso-contentType ?>
-<FormTemplates xmlns="http://schemas.microsoft.com/sharepoint/v3/contenttype/forms">
-  <Display>DocumentLibraryForm</Display>
-  <Edit>DocumentLibraryForm</Edit>
-  <New>DocumentLibraryForm</New>
-</FormTemplates>
-</file>
-
-<file path=customXml/item2.xml><?xml version="1.0" encoding="utf-8"?>
 <ct:contentTypeSchema xmlns:ct="http://schemas.microsoft.com/office/2006/metadata/contentType" xmlns:ma="http://schemas.microsoft.com/office/2006/metadata/properties/metaAttributes" ct:_="" ma:_="" ma:contentTypeName="Documento" ma:contentTypeID="0x010100E96778489EE7714D8BD12CC105EB918B" ma:contentTypeVersion="2" ma:contentTypeDescription="Crear nuevo documento." ma:contentTypeScope="" ma:versionID="416c5c7ae9b5d54d83875cd3c65194e3">
   <xsd:schema xmlns:xsd="http://www.w3.org/2001/XMLSchema" xmlns:xs="http://www.w3.org/2001/XMLSchema" xmlns:p="http://schemas.microsoft.com/office/2006/metadata/properties" xmlns:ns2="126e8a1c-9ea9-435a-ac89-d06c80d62e30" targetNamespace="http://schemas.microsoft.com/office/2006/metadata/properties" ma:root="true" ma:fieldsID="70a237c842677bd850644f8595079f5e" ns2:_="">
     <xsd:import namespace="126e8a1c-9ea9-435a-ac89-d06c80d62e30"/>
@@ -4938,6 +7434,15 @@
 </ct:contentTypeSchema>
 </file>
 
+<file path=customXml/item2.xml><?xml version="1.0" encoding="utf-8"?>
+<?mso-contentType ?>
+<FormTemplates xmlns="http://schemas.microsoft.com/sharepoint/v3/contenttype/forms">
+  <Display>DocumentLibraryForm</Display>
+  <Edit>DocumentLibraryForm</Edit>
+  <New>DocumentLibraryForm</New>
+</FormTemplates>
+</file>
+
 <file path=customXml/item3.xml><?xml version="1.0" encoding="utf-8"?>
 <p:properties xmlns:p="http://schemas.microsoft.com/office/2006/metadata/properties" xmlns:xsi="http://www.w3.org/2001/XMLSchema-instance" xmlns:pc="http://schemas.microsoft.com/office/infopath/2007/PartnerControls">
   <documentManagement/>
@@ -4945,14 +7450,6 @@
 </file>
 
 <file path=customXml/itemProps1.xml><?xml version="1.0" encoding="utf-8"?>
-<ds:datastoreItem xmlns:ds="http://schemas.openxmlformats.org/officeDocument/2006/customXml" ds:itemID="{D51C61E4-DB75-4684-AD25-71F546404E96}">
-  <ds:schemaRefs>
-    <ds:schemaRef ds:uri="http://schemas.microsoft.com/sharepoint/v3/contenttype/forms"/>
-  </ds:schemaRefs>
-</ds:datastoreItem>
-</file>
-
-<file path=customXml/itemProps2.xml><?xml version="1.0" encoding="utf-8"?>
 <ds:datastoreItem xmlns:ds="http://schemas.openxmlformats.org/officeDocument/2006/customXml" ds:itemID="{6F3661B0-5934-4FAB-ADC6-33A19B814E8D}">
   <ds:schemaRefs>
     <ds:schemaRef ds:uri="http://schemas.microsoft.com/office/2006/metadata/contentType"/>
@@ -4970,6 +7467,14 @@
 </ds:datastoreItem>
 </file>
 
+<file path=customXml/itemProps2.xml><?xml version="1.0" encoding="utf-8"?>
+<ds:datastoreItem xmlns:ds="http://schemas.openxmlformats.org/officeDocument/2006/customXml" ds:itemID="{D51C61E4-DB75-4684-AD25-71F546404E96}">
+  <ds:schemaRefs>
+    <ds:schemaRef ds:uri="http://schemas.microsoft.com/sharepoint/v3/contenttype/forms"/>
+  </ds:schemaRefs>
+</ds:datastoreItem>
+</file>
+
 <file path=customXml/itemProps3.xml><?xml version="1.0" encoding="utf-8"?>
 <ds:datastoreItem xmlns:ds="http://schemas.openxmlformats.org/officeDocument/2006/customXml" ds:itemID="{46CA5683-AF87-4E40-B841-2E23A3B52406}">
   <ds:schemaRefs>

</xml_diff>